<commit_message>
Update website PRD: replace static HTML/AWS stack with WordPress/managed hosting; update forms strategy and content management sections
</commit_message>
<xml_diff>
--- a/PRDs/CBM-PRD-Website.docx
+++ b/PRDs/CBM-PRD-Website.docx
@@ -221,92 +221,92 @@
         <w:spacing w:after="120"/>
       </w:pPr>
       <w:r>
-        <w:t xml:space="preserve">The website is implemented as a static site using plain HTML, CSS, and JavaScript. It is built with Claude Code as the development assistant. This approach was chosen over a CMS (e.g., WordPress) for the following reasons:</w:t>
-      </w:r>
-    </w:p>
-    <w:p>
-      <w:pPr>
-        <w:pStyle w:val="ListParagraph"/>
-        <w:numPr>
-          <w:ilvl w:val="0"/>
-          <w:numId w:val="2"/>
-        </w:numPr>
-        <w:spacing w:after="80"/>
-      </w:pPr>
-      <w:r>
-        <w:rPr>
-          <w:b w:val="false"/>
-          <w:bCs w:val="false"/>
-        </w:rPr>
-        <w:t xml:space="preserve">No CMS overhead — nothing to patch, update, or break</w:t>
-      </w:r>
-    </w:p>
-    <w:p>
-      <w:pPr>
-        <w:pStyle w:val="ListParagraph"/>
-        <w:numPr>
-          <w:ilvl w:val="0"/>
-          <w:numId w:val="2"/>
-        </w:numPr>
-        <w:spacing w:after="80"/>
-      </w:pPr>
-      <w:r>
-        <w:rPr>
-          <w:b w:val="false"/>
-          <w:bCs w:val="false"/>
-        </w:rPr>
-        <w:t xml:space="preserve">Extremely fast and lightweight — important for accessibility and older devices</w:t>
-      </w:r>
-    </w:p>
-    <w:p>
-      <w:pPr>
-        <w:pStyle w:val="ListParagraph"/>
-        <w:numPr>
-          <w:ilvl w:val="0"/>
-          <w:numId w:val="2"/>
-        </w:numPr>
-        <w:spacing w:after="80"/>
-      </w:pPr>
-      <w:r>
-        <w:rPr>
-          <w:b w:val="false"/>
-          <w:bCs w:val="false"/>
-        </w:rPr>
-        <w:t xml:space="preserve">Full control — no plugin conflicts or theme limitations</w:t>
-      </w:r>
-    </w:p>
-    <w:p>
-      <w:pPr>
-        <w:pStyle w:val="ListParagraph"/>
-        <w:numPr>
-          <w:ilvl w:val="0"/>
-          <w:numId w:val="2"/>
-        </w:numPr>
-        <w:spacing w:after="80"/>
-      </w:pPr>
-      <w:r>
-        <w:rPr>
-          <w:b w:val="false"/>
-          <w:bCs w:val="false"/>
-        </w:rPr>
-        <w:t xml:space="preserve">Negligible hosting cost on AWS S3</w:t>
-      </w:r>
-    </w:p>
-    <w:p>
-      <w:pPr>
-        <w:pStyle w:val="ListParagraph"/>
-        <w:numPr>
-          <w:ilvl w:val="0"/>
-          <w:numId w:val="2"/>
-        </w:numPr>
-        <w:spacing w:after="80"/>
-      </w:pPr>
-      <w:r>
-        <w:rPr>
-          <w:b w:val="false"/>
-          <w:bCs w:val="false"/>
-        </w:rPr>
-        <w:t xml:space="preserve">Claude Code is highly effective for iterating on a well-defined static site</w:t>
+        <w:t xml:space="preserve">The website is implemented in WordPress. This approach was chosen for the following reasons:</w:t>
+      </w:r>
+    </w:p>
+    <w:p>
+      <w:pPr>
+        <w:pStyle w:val="ListParagraph"/>
+        <w:numPr>
+          <w:ilvl w:val="0"/>
+          <w:numId w:val="2"/>
+        </w:numPr>
+        <w:spacing w:after="80"/>
+      </w:pPr>
+      <w:r>
+        <w:rPr>
+          <w:b w:val="false"/>
+          <w:bCs w:val="false"/>
+        </w:rPr>
+        <w:t xml:space="preserve">Rich plugin ecosystem — mature, well-supported plugins for forms, LMS integration, SEO, and accessibility</w:t>
+      </w:r>
+    </w:p>
+    <w:p>
+      <w:pPr>
+        <w:pStyle w:val="ListParagraph"/>
+        <w:numPr>
+          <w:ilvl w:val="0"/>
+          <w:numId w:val="2"/>
+        </w:numPr>
+        <w:spacing w:after="80"/>
+      </w:pPr>
+      <w:r>
+        <w:rPr>
+          <w:b w:val="false"/>
+          <w:bCs w:val="false"/>
+        </w:rPr>
+        <w:t xml:space="preserve">CRM integration — form plugins (Gravity Forms or WPForms) post data directly to EspoCRM via the REST API</w:t>
+      </w:r>
+    </w:p>
+    <w:p>
+      <w:pPr>
+        <w:pStyle w:val="ListParagraph"/>
+        <w:numPr>
+          <w:ilvl w:val="0"/>
+          <w:numId w:val="2"/>
+        </w:numPr>
+        <w:spacing w:after="80"/>
+      </w:pPr>
+      <w:r>
+        <w:rPr>
+          <w:b w:val="false"/>
+          <w:bCs w:val="false"/>
+        </w:rPr>
+        <w:t xml:space="preserve">LMS connectivity — proven integration paths between WordPress and Moodle</w:t>
+      </w:r>
+    </w:p>
+    <w:p>
+      <w:pPr>
+        <w:pStyle w:val="ListParagraph"/>
+        <w:numPr>
+          <w:ilvl w:val="0"/>
+          <w:numId w:val="2"/>
+        </w:numPr>
+        <w:spacing w:after="80"/>
+      </w:pPr>
+      <w:r>
+        <w:rPr>
+          <w:b w:val="false"/>
+          <w:bCs w:val="false"/>
+        </w:rPr>
+        <w:t xml:space="preserve">Content management — non-technical staff can update pages, events, and resources without developer involvement</w:t>
+      </w:r>
+    </w:p>
+    <w:p>
+      <w:pPr>
+        <w:pStyle w:val="ListParagraph"/>
+        <w:numPr>
+          <w:ilvl w:val="0"/>
+          <w:numId w:val="2"/>
+        </w:numPr>
+        <w:spacing w:after="80"/>
+      </w:pPr>
+      <w:r>
+        <w:rPr>
+          <w:b w:val="false"/>
+          <w:bCs w:val="false"/>
+        </w:rPr>
+        <w:t xml:space="preserve">Managed hosting options — the selected hosting provider handles WordPress core updates, security, backups, and SSL</w:t>
       </w:r>
     </w:p>
     <w:p>
@@ -322,496 +322,14 @@
         <w:t xml:space="preserve">3.2 Hosting Architecture</w:t>
       </w:r>
     </w:p>
-    <w:tbl>
-      <w:tblPr>
-        <w:tblW w:type="dxa" w:w="9360"/>
-        <w:tblBorders>
-          <w:top w:val="single" w:color="auto" w:sz="4"/>
-          <w:left w:val="single" w:color="auto" w:sz="4"/>
-          <w:bottom w:val="single" w:color="auto" w:sz="4"/>
-          <w:right w:val="single" w:color="auto" w:sz="4"/>
-          <w:insideH w:val="single" w:color="auto" w:sz="4"/>
-          <w:insideV w:val="single" w:color="auto" w:sz="4"/>
-        </w:tblBorders>
-      </w:tblPr>
-      <w:tblGrid>
-        <w:gridCol w:w="3000"/>
-        <w:gridCol w:w="6360"/>
-      </w:tblGrid>
-      <w:tr>
-        <w:trPr>
-          <w:tblHeader/>
-        </w:trPr>
-        <w:tc>
-          <w:tcPr>
-            <w:tcW w:type="dxa" w:w="3000"/>
-            <w:tcBorders>
-              <w:top w:val="single" w:color="CCCCCC" w:sz="1"/>
-              <w:left w:val="single" w:color="CCCCCC" w:sz="1"/>
-              <w:bottom w:val="single" w:color="CCCCCC" w:sz="1"/>
-              <w:right w:val="single" w:color="CCCCCC" w:sz="1"/>
-            </w:tcBorders>
-            <w:shd w:fill="1F4E79" w:val="clear"/>
-            <w:tcMar>
-              <w:top w:type="dxa" w:w="80"/>
-              <w:left w:type="dxa" w:w="120"/>
-              <w:bottom w:type="dxa" w:w="80"/>
-              <w:right w:type="dxa" w:w="120"/>
-            </w:tcMar>
-          </w:tcPr>
-          <w:p>
-            <w:r>
-              <w:rPr>
-                <w:rFonts w:ascii="Arial" w:cs="Arial" w:eastAsia="Arial" w:hAnsi="Arial"/>
-                <w:b/>
-                <w:bCs/>
-                <w:color w:val="FFFFFF"/>
-                <w:sz w:val="20"/>
-                <w:szCs w:val="20"/>
-              </w:rPr>
-              <w:t xml:space="preserve">Component</w:t>
-            </w:r>
-          </w:p>
-        </w:tc>
-        <w:tc>
-          <w:tcPr>
-            <w:tcW w:type="dxa" w:w="6360"/>
-            <w:tcBorders>
-              <w:top w:val="single" w:color="CCCCCC" w:sz="1"/>
-              <w:left w:val="single" w:color="CCCCCC" w:sz="1"/>
-              <w:bottom w:val="single" w:color="CCCCCC" w:sz="1"/>
-              <w:right w:val="single" w:color="CCCCCC" w:sz="1"/>
-            </w:tcBorders>
-            <w:shd w:fill="1F4E79" w:val="clear"/>
-            <w:tcMar>
-              <w:top w:type="dxa" w:w="80"/>
-              <w:left w:type="dxa" w:w="120"/>
-              <w:bottom w:type="dxa" w:w="80"/>
-              <w:right w:type="dxa" w:w="120"/>
-            </w:tcMar>
-          </w:tcPr>
-          <w:p>
-            <w:r>
-              <w:rPr>
-                <w:rFonts w:ascii="Arial" w:cs="Arial" w:eastAsia="Arial" w:hAnsi="Arial"/>
-                <w:b/>
-                <w:bCs/>
-                <w:color w:val="FFFFFF"/>
-                <w:sz w:val="20"/>
-                <w:szCs w:val="20"/>
-              </w:rPr>
-              <w:t xml:space="preserve">Service / Tool</w:t>
-            </w:r>
-          </w:p>
-        </w:tc>
-      </w:tr>
-      <w:tr>
-        <w:tc>
-          <w:tcPr>
-            <w:tcW w:type="dxa" w:w="3000"/>
-            <w:tcBorders>
-              <w:top w:val="single" w:color="CCCCCC" w:sz="1"/>
-              <w:left w:val="single" w:color="CCCCCC" w:sz="1"/>
-              <w:bottom w:val="single" w:color="CCCCCC" w:sz="1"/>
-              <w:right w:val="single" w:color="CCCCCC" w:sz="1"/>
-            </w:tcBorders>
-            <w:shd w:fill="FFFFFF" w:val="clear"/>
-            <w:tcMar>
-              <w:top w:type="dxa" w:w="80"/>
-              <w:left w:type="dxa" w:w="120"/>
-              <w:bottom w:type="dxa" w:w="80"/>
-              <w:right w:type="dxa" w:w="120"/>
-            </w:tcMar>
-          </w:tcPr>
-          <w:p>
-            <w:r>
-              <w:rPr>
-                <w:rFonts w:ascii="Arial" w:cs="Arial" w:eastAsia="Arial" w:hAnsi="Arial"/>
-                <w:sz w:val="20"/>
-                <w:szCs w:val="20"/>
-              </w:rPr>
-              <w:t xml:space="preserve">Static File Hosting</w:t>
-            </w:r>
-          </w:p>
-        </w:tc>
-        <w:tc>
-          <w:tcPr>
-            <w:tcW w:type="dxa" w:w="6360"/>
-            <w:tcBorders>
-              <w:top w:val="single" w:color="CCCCCC" w:sz="1"/>
-              <w:left w:val="single" w:color="CCCCCC" w:sz="1"/>
-              <w:bottom w:val="single" w:color="CCCCCC" w:sz="1"/>
-              <w:right w:val="single" w:color="CCCCCC" w:sz="1"/>
-            </w:tcBorders>
-            <w:shd w:fill="FFFFFF" w:val="clear"/>
-            <w:tcMar>
-              <w:top w:type="dxa" w:w="80"/>
-              <w:left w:type="dxa" w:w="120"/>
-              <w:bottom w:type="dxa" w:w="80"/>
-              <w:right w:type="dxa" w:w="120"/>
-            </w:tcMar>
-          </w:tcPr>
-          <w:p>
-            <w:r>
-              <w:rPr>
-                <w:rFonts w:ascii="Arial" w:cs="Arial" w:eastAsia="Arial" w:hAnsi="Arial"/>
-                <w:sz w:val="20"/>
-                <w:szCs w:val="20"/>
-              </w:rPr>
-              <w:t xml:space="preserve">AWS S3</w:t>
-            </w:r>
-          </w:p>
-        </w:tc>
-      </w:tr>
-      <w:tr>
-        <w:tc>
-          <w:tcPr>
-            <w:tcW w:type="dxa" w:w="3000"/>
-            <w:tcBorders>
-              <w:top w:val="single" w:color="CCCCCC" w:sz="1"/>
-              <w:left w:val="single" w:color="CCCCCC" w:sz="1"/>
-              <w:bottom w:val="single" w:color="CCCCCC" w:sz="1"/>
-              <w:right w:val="single" w:color="CCCCCC" w:sz="1"/>
-            </w:tcBorders>
-            <w:shd w:fill="F2F2F2" w:val="clear"/>
-            <w:tcMar>
-              <w:top w:type="dxa" w:w="80"/>
-              <w:left w:type="dxa" w:w="120"/>
-              <w:bottom w:type="dxa" w:w="80"/>
-              <w:right w:type="dxa" w:w="120"/>
-            </w:tcMar>
-          </w:tcPr>
-          <w:p>
-            <w:r>
-              <w:rPr>
-                <w:rFonts w:ascii="Arial" w:cs="Arial" w:eastAsia="Arial" w:hAnsi="Arial"/>
-                <w:sz w:val="20"/>
-                <w:szCs w:val="20"/>
-              </w:rPr>
-              <w:t xml:space="preserve">CDN &amp; SSL Termination</w:t>
-            </w:r>
-          </w:p>
-        </w:tc>
-        <w:tc>
-          <w:tcPr>
-            <w:tcW w:type="dxa" w:w="6360"/>
-            <w:tcBorders>
-              <w:top w:val="single" w:color="CCCCCC" w:sz="1"/>
-              <w:left w:val="single" w:color="CCCCCC" w:sz="1"/>
-              <w:bottom w:val="single" w:color="CCCCCC" w:sz="1"/>
-              <w:right w:val="single" w:color="CCCCCC" w:sz="1"/>
-            </w:tcBorders>
-            <w:shd w:fill="F2F2F2" w:val="clear"/>
-            <w:tcMar>
-              <w:top w:type="dxa" w:w="80"/>
-              <w:left w:type="dxa" w:w="120"/>
-              <w:bottom w:type="dxa" w:w="80"/>
-              <w:right w:type="dxa" w:w="120"/>
-            </w:tcMar>
-          </w:tcPr>
-          <w:p>
-            <w:r>
-              <w:rPr>
-                <w:rFonts w:ascii="Arial" w:cs="Arial" w:eastAsia="Arial" w:hAnsi="Arial"/>
-                <w:sz w:val="20"/>
-                <w:szCs w:val="20"/>
-              </w:rPr>
-              <w:t xml:space="preserve">AWS CloudFront</w:t>
-            </w:r>
-          </w:p>
-        </w:tc>
-      </w:tr>
-      <w:tr>
-        <w:tc>
-          <w:tcPr>
-            <w:tcW w:type="dxa" w:w="3000"/>
-            <w:tcBorders>
-              <w:top w:val="single" w:color="CCCCCC" w:sz="1"/>
-              <w:left w:val="single" w:color="CCCCCC" w:sz="1"/>
-              <w:bottom w:val="single" w:color="CCCCCC" w:sz="1"/>
-              <w:right w:val="single" w:color="CCCCCC" w:sz="1"/>
-            </w:tcBorders>
-            <w:shd w:fill="FFFFFF" w:val="clear"/>
-            <w:tcMar>
-              <w:top w:type="dxa" w:w="80"/>
-              <w:left w:type="dxa" w:w="120"/>
-              <w:bottom w:type="dxa" w:w="80"/>
-              <w:right w:type="dxa" w:w="120"/>
-            </w:tcMar>
-          </w:tcPr>
-          <w:p>
-            <w:r>
-              <w:rPr>
-                <w:rFonts w:ascii="Arial" w:cs="Arial" w:eastAsia="Arial" w:hAnsi="Arial"/>
-                <w:sz w:val="20"/>
-                <w:szCs w:val="20"/>
-              </w:rPr>
-              <w:t xml:space="preserve">DNS Management</w:t>
-            </w:r>
-          </w:p>
-        </w:tc>
-        <w:tc>
-          <w:tcPr>
-            <w:tcW w:type="dxa" w:w="6360"/>
-            <w:tcBorders>
-              <w:top w:val="single" w:color="CCCCCC" w:sz="1"/>
-              <w:left w:val="single" w:color="CCCCCC" w:sz="1"/>
-              <w:bottom w:val="single" w:color="CCCCCC" w:sz="1"/>
-              <w:right w:val="single" w:color="CCCCCC" w:sz="1"/>
-            </w:tcBorders>
-            <w:shd w:fill="FFFFFF" w:val="clear"/>
-            <w:tcMar>
-              <w:top w:type="dxa" w:w="80"/>
-              <w:left w:type="dxa" w:w="120"/>
-              <w:bottom w:type="dxa" w:w="80"/>
-              <w:right w:type="dxa" w:w="120"/>
-            </w:tcMar>
-          </w:tcPr>
-          <w:p>
-            <w:r>
-              <w:rPr>
-                <w:rFonts w:ascii="Arial" w:cs="Arial" w:eastAsia="Arial" w:hAnsi="Arial"/>
-                <w:sz w:val="20"/>
-                <w:szCs w:val="20"/>
-              </w:rPr>
-              <w:t xml:space="preserve">AWS Route 53</w:t>
-            </w:r>
-          </w:p>
-        </w:tc>
-      </w:tr>
-      <w:tr>
-        <w:tc>
-          <w:tcPr>
-            <w:tcW w:type="dxa" w:w="3000"/>
-            <w:tcBorders>
-              <w:top w:val="single" w:color="CCCCCC" w:sz="1"/>
-              <w:left w:val="single" w:color="CCCCCC" w:sz="1"/>
-              <w:bottom w:val="single" w:color="CCCCCC" w:sz="1"/>
-              <w:right w:val="single" w:color="CCCCCC" w:sz="1"/>
-            </w:tcBorders>
-            <w:shd w:fill="F2F2F2" w:val="clear"/>
-            <w:tcMar>
-              <w:top w:type="dxa" w:w="80"/>
-              <w:left w:type="dxa" w:w="120"/>
-              <w:bottom w:type="dxa" w:w="80"/>
-              <w:right w:type="dxa" w:w="120"/>
-            </w:tcMar>
-          </w:tcPr>
-          <w:p>
-            <w:r>
-              <w:rPr>
-                <w:rFonts w:ascii="Arial" w:cs="Arial" w:eastAsia="Arial" w:hAnsi="Arial"/>
-                <w:sz w:val="20"/>
-                <w:szCs w:val="20"/>
-              </w:rPr>
-              <w:t xml:space="preserve">Domain Registration</w:t>
-            </w:r>
-          </w:p>
-        </w:tc>
-        <w:tc>
-          <w:tcPr>
-            <w:tcW w:type="dxa" w:w="6360"/>
-            <w:tcBorders>
-              <w:top w:val="single" w:color="CCCCCC" w:sz="1"/>
-              <w:left w:val="single" w:color="CCCCCC" w:sz="1"/>
-              <w:bottom w:val="single" w:color="CCCCCC" w:sz="1"/>
-              <w:right w:val="single" w:color="CCCCCC" w:sz="1"/>
-            </w:tcBorders>
-            <w:shd w:fill="F2F2F2" w:val="clear"/>
-            <w:tcMar>
-              <w:top w:type="dxa" w:w="80"/>
-              <w:left w:type="dxa" w:w="120"/>
-              <w:bottom w:type="dxa" w:w="80"/>
-              <w:right w:type="dxa" w:w="120"/>
-            </w:tcMar>
-          </w:tcPr>
-          <w:p>
-            <w:r>
-              <w:rPr>
-                <w:rFonts w:ascii="Arial" w:cs="Arial" w:eastAsia="Arial" w:hAnsi="Arial"/>
-                <w:sz w:val="20"/>
-                <w:szCs w:val="20"/>
-              </w:rPr>
-              <w:t xml:space="preserve">AWS Route 53</w:t>
-            </w:r>
-          </w:p>
-        </w:tc>
-      </w:tr>
-      <w:tr>
-        <w:tc>
-          <w:tcPr>
-            <w:tcW w:type="dxa" w:w="3000"/>
-            <w:tcBorders>
-              <w:top w:val="single" w:color="CCCCCC" w:sz="1"/>
-              <w:left w:val="single" w:color="CCCCCC" w:sz="1"/>
-              <w:bottom w:val="single" w:color="CCCCCC" w:sz="1"/>
-              <w:right w:val="single" w:color="CCCCCC" w:sz="1"/>
-            </w:tcBorders>
-            <w:shd w:fill="FFFFFF" w:val="clear"/>
-            <w:tcMar>
-              <w:top w:type="dxa" w:w="80"/>
-              <w:left w:type="dxa" w:w="120"/>
-              <w:bottom w:type="dxa" w:w="80"/>
-              <w:right w:type="dxa" w:w="120"/>
-            </w:tcMar>
-          </w:tcPr>
-          <w:p>
-            <w:r>
-              <w:rPr>
-                <w:rFonts w:ascii="Arial" w:cs="Arial" w:eastAsia="Arial" w:hAnsi="Arial"/>
-                <w:sz w:val="20"/>
-                <w:szCs w:val="20"/>
-              </w:rPr>
-              <w:t xml:space="preserve">Source Control</w:t>
-            </w:r>
-          </w:p>
-        </w:tc>
-        <w:tc>
-          <w:tcPr>
-            <w:tcW w:type="dxa" w:w="6360"/>
-            <w:tcBorders>
-              <w:top w:val="single" w:color="CCCCCC" w:sz="1"/>
-              <w:left w:val="single" w:color="CCCCCC" w:sz="1"/>
-              <w:bottom w:val="single" w:color="CCCCCC" w:sz="1"/>
-              <w:right w:val="single" w:color="CCCCCC" w:sz="1"/>
-            </w:tcBorders>
-            <w:shd w:fill="FFFFFF" w:val="clear"/>
-            <w:tcMar>
-              <w:top w:type="dxa" w:w="80"/>
-              <w:left w:type="dxa" w:w="120"/>
-              <w:bottom w:type="dxa" w:w="80"/>
-              <w:right w:type="dxa" w:w="120"/>
-            </w:tcMar>
-          </w:tcPr>
-          <w:p>
-            <w:r>
-              <w:rPr>
-                <w:rFonts w:ascii="Arial" w:cs="Arial" w:eastAsia="Arial" w:hAnsi="Arial"/>
-                <w:sz w:val="20"/>
-                <w:szCs w:val="20"/>
-              </w:rPr>
-              <w:t xml:space="preserve">AWS CodeCommit</w:t>
-            </w:r>
-          </w:p>
-        </w:tc>
-      </w:tr>
-      <w:tr>
-        <w:tc>
-          <w:tcPr>
-            <w:tcW w:type="dxa" w:w="3000"/>
-            <w:tcBorders>
-              <w:top w:val="single" w:color="CCCCCC" w:sz="1"/>
-              <w:left w:val="single" w:color="CCCCCC" w:sz="1"/>
-              <w:bottom w:val="single" w:color="CCCCCC" w:sz="1"/>
-              <w:right w:val="single" w:color="CCCCCC" w:sz="1"/>
-            </w:tcBorders>
-            <w:shd w:fill="F2F2F2" w:val="clear"/>
-            <w:tcMar>
-              <w:top w:type="dxa" w:w="80"/>
-              <w:left w:type="dxa" w:w="120"/>
-              <w:bottom w:type="dxa" w:w="80"/>
-              <w:right w:type="dxa" w:w="120"/>
-            </w:tcMar>
-          </w:tcPr>
-          <w:p>
-            <w:r>
-              <w:rPr>
-                <w:rFonts w:ascii="Arial" w:cs="Arial" w:eastAsia="Arial" w:hAnsi="Arial"/>
-                <w:sz w:val="20"/>
-                <w:szCs w:val="20"/>
-              </w:rPr>
-              <w:t xml:space="preserve">CI/CD Pipeline</w:t>
-            </w:r>
-          </w:p>
-        </w:tc>
-        <w:tc>
-          <w:tcPr>
-            <w:tcW w:type="dxa" w:w="6360"/>
-            <w:tcBorders>
-              <w:top w:val="single" w:color="CCCCCC" w:sz="1"/>
-              <w:left w:val="single" w:color="CCCCCC" w:sz="1"/>
-              <w:bottom w:val="single" w:color="CCCCCC" w:sz="1"/>
-              <w:right w:val="single" w:color="CCCCCC" w:sz="1"/>
-            </w:tcBorders>
-            <w:shd w:fill="F2F2F2" w:val="clear"/>
-            <w:tcMar>
-              <w:top w:type="dxa" w:w="80"/>
-              <w:left w:type="dxa" w:w="120"/>
-              <w:bottom w:type="dxa" w:w="80"/>
-              <w:right w:type="dxa" w:w="120"/>
-            </w:tcMar>
-          </w:tcPr>
-          <w:p>
-            <w:r>
-              <w:rPr>
-                <w:rFonts w:ascii="Arial" w:cs="Arial" w:eastAsia="Arial" w:hAnsi="Arial"/>
-                <w:sz w:val="20"/>
-                <w:szCs w:val="20"/>
-              </w:rPr>
-              <w:t xml:space="preserve">AWS CodePipeline</w:t>
-            </w:r>
-          </w:p>
-        </w:tc>
-      </w:tr>
-      <w:tr>
-        <w:tc>
-          <w:tcPr>
-            <w:tcW w:type="dxa" w:w="3000"/>
-            <w:tcBorders>
-              <w:top w:val="single" w:color="CCCCCC" w:sz="1"/>
-              <w:left w:val="single" w:color="CCCCCC" w:sz="1"/>
-              <w:bottom w:val="single" w:color="CCCCCC" w:sz="1"/>
-              <w:right w:val="single" w:color="CCCCCC" w:sz="1"/>
-            </w:tcBorders>
-            <w:shd w:fill="FFFFFF" w:val="clear"/>
-            <w:tcMar>
-              <w:top w:type="dxa" w:w="80"/>
-              <w:left w:type="dxa" w:w="120"/>
-              <w:bottom w:type="dxa" w:w="80"/>
-              <w:right w:type="dxa" w:w="120"/>
-            </w:tcMar>
-          </w:tcPr>
-          <w:p>
-            <w:r>
-              <w:rPr>
-                <w:rFonts w:ascii="Arial" w:cs="Arial" w:eastAsia="Arial" w:hAnsi="Arial"/>
-                <w:sz w:val="20"/>
-                <w:szCs w:val="20"/>
-              </w:rPr>
-              <w:t xml:space="preserve">Development Tool</w:t>
-            </w:r>
-          </w:p>
-        </w:tc>
-        <w:tc>
-          <w:tcPr>
-            <w:tcW w:type="dxa" w:w="6360"/>
-            <w:tcBorders>
-              <w:top w:val="single" w:color="CCCCCC" w:sz="1"/>
-              <w:left w:val="single" w:color="CCCCCC" w:sz="1"/>
-              <w:bottom w:val="single" w:color="CCCCCC" w:sz="1"/>
-              <w:right w:val="single" w:color="CCCCCC" w:sz="1"/>
-            </w:tcBorders>
-            <w:shd w:fill="FFFFFF" w:val="clear"/>
-            <w:tcMar>
-              <w:top w:type="dxa" w:w="80"/>
-              <w:left w:type="dxa" w:w="120"/>
-              <w:bottom w:type="dxa" w:w="80"/>
-              <w:right w:type="dxa" w:w="120"/>
-            </w:tcMar>
-          </w:tcPr>
-          <w:p>
-            <w:r>
-              <w:rPr>
-                <w:rFonts w:ascii="Arial" w:cs="Arial" w:eastAsia="Arial" w:hAnsi="Arial"/>
-                <w:sz w:val="20"/>
-                <w:szCs w:val="20"/>
-              </w:rPr>
-              <w:t xml:space="preserve">Claude Code (AI-assisted development)</w:t>
-            </w:r>
-          </w:p>
-        </w:tc>
-      </w:tr>
-    </w:tbl>
+    <w:p>
+      <w:pPr>
+        <w:spacing w:after="120"/>
+      </w:pPr>
+      <w:r>
+        <w:t xml:space="preserve">The website is hosted on a managed WordPress hosting provider. Managed WordPress hosting was selected to ensure WordPress core updates, security patches, daily backups, SSL, and server maintenance are handled by the provider rather than volunteer staff. The specific hosting provider is To Be Determined. Candidates under evaluation include managed WordPress platforms offering nonprofit discounts and Google Cloud infrastructure.</w:t>
+      </w:r>
+    </w:p>
     <w:p>
       <w:r>
         <w:t xml:space="preserve"/>
@@ -822,7 +340,7 @@
         <w:pStyle w:val="Heading2"/>
       </w:pPr>
       <w:r>
-        <w:t xml:space="preserve">3.3 CI/CD Pipeline</w:t>
+        <w:t xml:space="preserve">3.3 Deployment &amp; Updates</w:t>
       </w:r>
     </w:p>
     <w:p>
@@ -830,7 +348,7 @@
         <w:spacing w:after="120"/>
       </w:pPr>
       <w:r>
-        <w:t xml:space="preserve">All website changes are managed through a Git-based CI/CD pipeline:</w:t>
+        <w:t xml:space="preserve">Website updates are managed through the WordPress admin interface and deployed by the hosting provider’s managed infrastructure. The deployment model works as follows:</w:t>
       </w:r>
     </w:p>
     <w:p>
@@ -843,7 +361,7 @@
         <w:spacing w:after="80"/>
       </w:pPr>
       <w:r>
-        <w:t xml:space="preserve">Developer pushes changes to AWS CodeCommit main branch</w:t>
+        <w:t xml:space="preserve">Content updates (pages, posts, events) are made directly in the WordPress admin dashboard by authorized staff</w:t>
       </w:r>
     </w:p>
     <w:p>
@@ -856,7 +374,7 @@
         <w:spacing w:after="80"/>
       </w:pPr>
       <w:r>
-        <w:t xml:space="preserve">AWS CodePipeline detects the push and triggers a build</w:t>
+        <w:t xml:space="preserve">Theme, plugin, and configuration changes are managed by the tech admin via the WordPress admin interface or SFTP</w:t>
       </w:r>
     </w:p>
     <w:p>
@@ -869,7 +387,7 @@
         <w:spacing w:after="80"/>
       </w:pPr>
       <w:r>
-        <w:t xml:space="preserve">Build artifacts (HTML/CSS/JS) are deployed to S3</w:t>
+        <w:t xml:space="preserve">WordPress core, theme, and plugin updates are applied by the tech admin and tested in a staging environment before going live</w:t>
       </w:r>
     </w:p>
     <w:p>
@@ -882,7 +400,7 @@
         <w:spacing w:after="80"/>
       </w:pPr>
       <w:r>
-        <w:t xml:space="preserve">CloudFront cache is invalidated — changes are live within minutes</w:t>
+        <w:t xml:space="preserve">The hosting provider manages automatic daily backups, SSL renewal, and server-level security</w:t>
       </w:r>
     </w:p>
     <w:p>
@@ -890,7 +408,7 @@
         <w:spacing w:after="120"/>
       </w:pPr>
       <w:r>
-        <w:t xml:space="preserve">This approach ensures every change is version controlled, deployment is automated, and future contributors can submit changes for review before going live.</w:t>
+        <w:t xml:space="preserve">This approach minimizes the operational burden on volunteer staff while ensuring the site remains secure, up to date, and reliably available.</w:t>
       </w:r>
     </w:p>
     <w:p>
@@ -911,75 +429,75 @@
         <w:spacing w:after="120"/>
       </w:pPr>
       <w:r>
-        <w:t xml:space="preserve">As a static site, the website cannot natively process form submissions. All dynamic functionality is handled through CRM integration:</w:t>
-      </w:r>
-    </w:p>
-    <w:p>
-      <w:pPr>
-        <w:pStyle w:val="ListParagraph"/>
-        <w:numPr>
-          <w:ilvl w:val="0"/>
-          <w:numId w:val="2"/>
-        </w:numPr>
-        <w:spacing w:after="80"/>
-      </w:pPr>
-      <w:r>
-        <w:rPr>
-          <w:b w:val="false"/>
-          <w:bCs w:val="false"/>
-        </w:rPr>
-        <w:t xml:space="preserve">Client intake / mentoring request form — CRM-native, embedded or linked</w:t>
-      </w:r>
-    </w:p>
-    <w:p>
-      <w:pPr>
-        <w:pStyle w:val="ListParagraph"/>
-        <w:numPr>
-          <w:ilvl w:val="0"/>
-          <w:numId w:val="2"/>
-        </w:numPr>
-        <w:spacing w:after="80"/>
-      </w:pPr>
-      <w:r>
-        <w:rPr>
-          <w:b w:val="false"/>
-          <w:bCs w:val="false"/>
-        </w:rPr>
-        <w:t xml:space="preserve">Volunteer interest / signup form — CRM-native, embedded or linked</w:t>
-      </w:r>
-    </w:p>
-    <w:p>
-      <w:pPr>
-        <w:pStyle w:val="ListParagraph"/>
-        <w:numPr>
-          <w:ilvl w:val="0"/>
-          <w:numId w:val="2"/>
-        </w:numPr>
-        <w:spacing w:after="80"/>
-      </w:pPr>
-      <w:r>
-        <w:rPr>
-          <w:b w:val="false"/>
-          <w:bCs w:val="false"/>
-        </w:rPr>
-        <w:t xml:space="preserve">Workshop registration — CRM-native event registration</w:t>
-      </w:r>
-    </w:p>
-    <w:p>
-      <w:pPr>
-        <w:pStyle w:val="ListParagraph"/>
-        <w:numPr>
-          <w:ilvl w:val="0"/>
-          <w:numId w:val="2"/>
-        </w:numPr>
-        <w:spacing w:after="80"/>
-      </w:pPr>
-      <w:r>
-        <w:rPr>
-          <w:b w:val="false"/>
-          <w:bCs w:val="false"/>
-        </w:rPr>
-        <w:t xml:space="preserve">Contact form — CRM-native or lightweight email forwarding service</w:t>
+        <w:t xml:space="preserve">WordPress natively supports dynamic form processing through plugins. All intake and registration forms on the CBM website are built using a WordPress form plugin (Gravity Forms or WPForms) and post data directly to EspoCRM via the REST API. The key forms and their integration targets are:</w:t>
+      </w:r>
+    </w:p>
+    <w:p>
+      <w:pPr>
+        <w:pStyle w:val="ListParagraph"/>
+        <w:numPr>
+          <w:ilvl w:val="0"/>
+          <w:numId w:val="2"/>
+        </w:numPr>
+        <w:spacing w:after="80"/>
+      </w:pPr>
+      <w:r>
+        <w:rPr>
+          <w:b w:val="false"/>
+          <w:bCs w:val="false"/>
+        </w:rPr>
+        <w:t xml:space="preserve">Client Mentoring Request form — posts to EspoCRM REST API; creates linked Company, Contact, and Engagement records (Engagement Status = Submitted)</w:t>
+      </w:r>
+    </w:p>
+    <w:p>
+      <w:pPr>
+        <w:pStyle w:val="ListParagraph"/>
+        <w:numPr>
+          <w:ilvl w:val="0"/>
+          <w:numId w:val="2"/>
+        </w:numPr>
+        <w:spacing w:after="80"/>
+      </w:pPr>
+      <w:r>
+        <w:rPr>
+          <w:b w:val="false"/>
+          <w:bCs w:val="false"/>
+        </w:rPr>
+        <w:t xml:space="preserve">Mentor Application form — posts to EspoCRM REST API; creates a Contact record (Contact Type = Mentor, Mentor Status = Submitted)</w:t>
+      </w:r>
+    </w:p>
+    <w:p>
+      <w:pPr>
+        <w:pStyle w:val="ListParagraph"/>
+        <w:numPr>
+          <w:ilvl w:val="0"/>
+          <w:numId w:val="2"/>
+        </w:numPr>
+        <w:spacing w:after="80"/>
+      </w:pPr>
+      <w:r>
+        <w:rPr>
+          <w:b w:val="false"/>
+          <w:bCs w:val="false"/>
+        </w:rPr>
+        <w:t xml:space="preserve">Workshop &amp; Event Registration — to be defined; integration target TBD pending LMS and event management decisions</w:t>
+      </w:r>
+    </w:p>
+    <w:p>
+      <w:pPr>
+        <w:pStyle w:val="ListParagraph"/>
+        <w:numPr>
+          <w:ilvl w:val="0"/>
+          <w:numId w:val="2"/>
+        </w:numPr>
+        <w:spacing w:after="80"/>
+      </w:pPr>
+      <w:r>
+        <w:rPr>
+          <w:b w:val="false"/>
+          <w:bCs w:val="false"/>
+        </w:rPr>
+        <w:t xml:space="preserve">Contact form — routes to CBM admin email via WordPress form plugin email notification; no CRM record created</w:t>
       </w:r>
     </w:p>
     <w:p>
@@ -992,7 +510,7 @@
           <w:iCs/>
           <w:color w:val="595959"/>
         </w:rPr>
-        <w:t xml:space="preserve">Note: The specific integration method (embedded iframe, API call, or redirect to CRM portal) will be determined during CRM selection. The website architecture supports all approaches.</w:t>
+        <w:t xml:space="preserve">Note: The WordPress form plugin selection (Gravity Forms vs. WPForms) is To Be Determined. Both support REST API webhooks and are compatible with the EspoCRM integration approach. Final selection will be made prior to site build.</w:t>
       </w:r>
     </w:p>
     <w:p>
@@ -1861,7 +1379,7 @@
         <w:spacing w:after="120"/>
       </w:pPr>
       <w:r>
-        <w:t xml:space="preserve">Since the site is static HTML, content updates require editing source files and pushing to CodeCommit to trigger a deployment. This is manageable for the tech admin.</w:t>
+        <w:t xml:space="preserve">Since the site is built on WordPress, content updates are made directly in the WordPress admin dashboard without requiring developer involvement. Pages, events, and resource listings can be edited by any authorized staff member or volunteer with appropriate admin credentials.</w:t>
       </w:r>
     </w:p>
     <w:p>
@@ -1869,7 +1387,7 @@
         <w:spacing w:after="120"/>
       </w:pPr>
       <w:r>
-        <w:t xml:space="preserve">As the organization grows and content ownership expands, consider a lightweight headless CMS (e.g., Decap CMS, formerly Netlify CMS) that can sit in front of the static site without changing the hosting architecture.</w:t>
+        <w:t xml:space="preserve">As the organization grows and content ownership expands, WordPress user roles and permissions can be configured to give specific staff or volunteers access to only the content areas they manage, without exposing theme or plugin settings.</w:t>
       </w:r>
     </w:p>
     <w:p>

</xml_diff>

<commit_message>
Add Sections 4.1 and 4.2 to website PRD: Client Mentoring Request Form and Mentor Application Form definitions
</commit_message>
<xml_diff>
--- a/PRDs/CBM-PRD-Website.docx
+++ b/PRDs/CBM-PRD-Website.docx
@@ -514,6 +514,1485 @@
       </w:r>
     </w:p>
     <w:p>
+      <w:r>
+        <w:t xml:space="preserve"/>
+      </w:r>
+    </w:p>
+    <w:p>
+      <w:pPr>
+        <w:pStyle w:val="Heading2"/>
+      </w:pPr>
+      <w:r>
+        <w:t xml:space="preserve">4.1 Client Mentoring Request Form</w:t>
+      </w:r>
+    </w:p>
+    <w:p>
+      <w:pPr>
+        <w:spacing w:after="120"/>
+      </w:pPr>
+      <w:r>
+        <w:t xml:space="preserve">The Client Mentoring Request form is the primary intake channel for prospective clients. It is a public-facing WordPress form accessible from the Get Mentoring page. On submission, the form posts data to EspoCRM via the REST API and automatically creates three linked records: a Company record (the business), a Contact record (the submitting individual, flagged as Primary Contact), and an Engagement record with Status = Submitted. The new submission appears immediately in the admin’s Submitted Engagements list view for review and assignment.</w:t>
+      </w:r>
+    </w:p>
+    <w:p>
+      <w:pPr>
+        <w:spacing w:after="80"/>
+      </w:pPr>
+      <w:r>
+        <w:rPr>
+          <w:b/>
+        </w:rPr>
+        <w:t xml:space="preserve">Post-Submission Behavior</w:t>
+      </w:r>
+    </w:p>
+    <w:p>
+      <w:pPr>
+        <w:pStyle w:val="ListParagraph"/>
+        <w:numPr>
+          <w:ilvl w:val="0"/>
+          <w:numId w:val="2"/>
+        </w:numPr>
+        <w:spacing w:after="60"/>
+      </w:pPr>
+      <w:r>
+        <w:t xml:space="preserve">EspoCRM creates linked Company, Contact, and Engagement records (Engagement Status = Submitted)</w:t>
+      </w:r>
+    </w:p>
+    <w:p>
+      <w:pPr>
+        <w:pStyle w:val="ListParagraph"/>
+        <w:numPr>
+          <w:ilvl w:val="0"/>
+          <w:numId w:val="2"/>
+        </w:numPr>
+        <w:spacing w:after="60"/>
+      </w:pPr>
+      <w:r>
+        <w:t xml:space="preserve">Admin receives an automatic system notification of the new submission</w:t>
+      </w:r>
+    </w:p>
+    <w:p>
+      <w:pPr>
+        <w:pStyle w:val="ListParagraph"/>
+        <w:numPr>
+          <w:ilvl w:val="0"/>
+          <w:numId w:val="2"/>
+        </w:numPr>
+        <w:spacing w:after="60"/>
+      </w:pPr>
+      <w:r>
+        <w:t xml:space="preserve">Submitter receives a confirmation email acknowledging receipt of their request</w:t>
+      </w:r>
+    </w:p>
+    <w:p>
+      <w:pPr>
+        <w:pStyle w:val="ListParagraph"/>
+        <w:numPr>
+          <w:ilvl w:val="0"/>
+          <w:numId w:val="2"/>
+        </w:numPr>
+        <w:spacing w:after="60"/>
+      </w:pPr>
+      <w:r>
+        <w:t xml:space="preserve">If the request is declined after admin review, Engagement Status is set to Declined and the admin notifies the applicant manually</w:t>
+      </w:r>
+    </w:p>
+    <w:p>
+      <w:pPr>
+        <w:spacing w:after="80"/>
+      </w:pPr>
+      <w:r>
+        <w:rPr>
+          <w:b/>
+        </w:rPr>
+        <w:t xml:space="preserve">Form Fields</w:t>
+      </w:r>
+    </w:p>
+    <w:p>
+      <w:pPr>
+        <w:spacing w:after="60"/>
+      </w:pPr>
+      <w:r>
+        <w:t xml:space="preserve">The following fields are collected on the form. Fields marked Required must be completed before the form can be submitted. Contact record fields are noted; all remaining fields populate the Company record.</w:t>
+      </w:r>
+    </w:p>
+    <w:tbl>
+      <w:tblPr>
+        <w:tblW w:type="dxa" w:w="9360"/>
+        <w:tblBorders>
+          <w:top w:val="single" w:color="CCCCCC" w:sz="4"/>
+          <w:left w:val="single" w:color="CCCCCC" w:sz="4"/>
+          <w:bottom w:val="single" w:color="CCCCCC" w:sz="4"/>
+          <w:right w:val="single" w:color="CCCCCC" w:sz="4"/>
+          <w:insideH w:val="single" w:color="CCCCCC" w:sz="4"/>
+          <w:insideV w:val="single" w:color="CCCCCC" w:sz="4"/>
+        </w:tblBorders>
+        <w:tblCellMar>
+          <w:top w:type="dxa" w:w="80"/>
+          <w:left w:type="dxa" w:w="120"/>
+          <w:bottom w:type="dxa" w:w="80"/>
+          <w:right w:type="dxa" w:w="120"/>
+        </w:tblCellMar>
+      </w:tblPr>
+      <w:tblGrid>
+        <w:gridCol w:w="2200"/>
+        <w:gridCol w:w="1400"/>
+        <w:gridCol w:w="5760"/>
+      </w:tblGrid>
+      <w:tr>
+        <w:trPr>
+          <w:tblHeader/>
+        </w:trPr>
+        <w:tc>
+          <w:tcPr>
+            <w:tcW w:type="dxa" w:w="2200"/>
+            <w:shd w:fill="2C5F8A" w:val="clear"/>
+          </w:tcPr>
+          <w:p>
+            <w:r>
+              <w:rPr>
+                <w:b/>
+                <w:color w:val="FFFFFF"/>
+              </w:rPr>
+              <w:t>Field</w:t>
+            </w:r>
+          </w:p>
+        </w:tc>
+        <w:tc>
+          <w:tcPr>
+            <w:tcW w:type="dxa" w:w="1400"/>
+            <w:shd w:fill="2C5F8A" w:val="clear"/>
+          </w:tcPr>
+          <w:p>
+            <w:r>
+              <w:rPr>
+                <w:b/>
+                <w:color w:val="FFFFFF"/>
+              </w:rPr>
+              <w:t>Required</w:t>
+            </w:r>
+          </w:p>
+        </w:tc>
+        <w:tc>
+          <w:tcPr>
+            <w:tcW w:type="dxa" w:w="5760"/>
+            <w:shd w:fill="2C5F8A" w:val="clear"/>
+          </w:tcPr>
+          <w:p>
+            <w:r>
+              <w:rPr>
+                <w:b/>
+                <w:color w:val="FFFFFF"/>
+              </w:rPr>
+              <w:t>Description / Notes</w:t>
+            </w:r>
+          </w:p>
+        </w:tc>
+      </w:tr>
+      <w:tr>
+        <w:tc>
+          <w:tcPr>
+            <w:tcW w:type="dxa" w:w="2200"/>
+            <w:shd w:fill="E8F0F7" w:val="clear"/>
+          </w:tcPr>
+          <w:p>
+            <w:r>
+              <w:rPr>
+                <w:b/>
+              </w:rPr>
+              <w:t>First Name</w:t>
+            </w:r>
+          </w:p>
+        </w:tc>
+        <w:tc>
+          <w:tcPr>
+            <w:tcW w:type="dxa" w:w="1400"/>
+          </w:tcPr>
+          <w:p>
+            <w:r>
+              <w:t>Yes</w:t>
+            </w:r>
+          </w:p>
+        </w:tc>
+        <w:tc>
+          <w:tcPr>
+            <w:tcW w:type="dxa" w:w="5760"/>
+          </w:tcPr>
+          <w:p>
+            <w:r>
+              <w:t xml:space="preserve">Text field. Populates Contact record.</w:t>
+            </w:r>
+          </w:p>
+        </w:tc>
+      </w:tr>
+      <w:tr>
+        <w:tc>
+          <w:tcPr>
+            <w:tcW w:type="dxa" w:w="2200"/>
+          </w:tcPr>
+          <w:p>
+            <w:r>
+              <w:rPr>
+                <w:b/>
+              </w:rPr>
+              <w:t>Last Name</w:t>
+            </w:r>
+          </w:p>
+        </w:tc>
+        <w:tc>
+          <w:tcPr>
+            <w:tcW w:type="dxa" w:w="1400"/>
+          </w:tcPr>
+          <w:p>
+            <w:r>
+              <w:t>Yes</w:t>
+            </w:r>
+          </w:p>
+        </w:tc>
+        <w:tc>
+          <w:tcPr>
+            <w:tcW w:type="dxa" w:w="5760"/>
+          </w:tcPr>
+          <w:p>
+            <w:r>
+              <w:t xml:space="preserve">Text field. Populates Contact record.</w:t>
+            </w:r>
+          </w:p>
+        </w:tc>
+      </w:tr>
+      <w:tr>
+        <w:tc>
+          <w:tcPr>
+            <w:tcW w:type="dxa" w:w="2200"/>
+            <w:shd w:fill="E8F0F7" w:val="clear"/>
+          </w:tcPr>
+          <w:p>
+            <w:r>
+              <w:rPr>
+                <w:b/>
+              </w:rPr>
+              <w:t>Email Address</w:t>
+            </w:r>
+          </w:p>
+        </w:tc>
+        <w:tc>
+          <w:tcPr>
+            <w:tcW w:type="dxa" w:w="1400"/>
+            <w:shd w:fill="E8F0F7" w:val="clear"/>
+          </w:tcPr>
+          <w:p>
+            <w:r>
+              <w:t>Yes</w:t>
+            </w:r>
+          </w:p>
+        </w:tc>
+        <w:tc>
+          <w:tcPr>
+            <w:tcW w:type="dxa" w:w="5760"/>
+            <w:shd w:fill="E8F0F7" w:val="clear"/>
+          </w:tcPr>
+          <w:p>
+            <w:r>
+              <w:t xml:space="preserve">Email field. Populates Contact record. Used for all follow-up communications including mentor introduction and Phase 2 form delivery.</w:t>
+            </w:r>
+          </w:p>
+        </w:tc>
+      </w:tr>
+      <w:tr>
+        <w:tc>
+          <w:tcPr>
+            <w:tcW w:type="dxa" w:w="2200"/>
+          </w:tcPr>
+          <w:p>
+            <w:r>
+              <w:rPr>
+                <w:b/>
+              </w:rPr>
+              <w:t>Phone</w:t>
+            </w:r>
+          </w:p>
+        </w:tc>
+        <w:tc>
+          <w:tcPr>
+            <w:tcW w:type="dxa" w:w="1400"/>
+          </w:tcPr>
+          <w:p>
+            <w:r>
+              <w:t>Yes</w:t>
+            </w:r>
+          </w:p>
+        </w:tc>
+        <w:tc>
+          <w:tcPr>
+            <w:tcW w:type="dxa" w:w="5760"/>
+          </w:tcPr>
+          <w:p>
+            <w:r>
+              <w:t xml:space="preserve">Phone field. Populates Contact record.</w:t>
+            </w:r>
+          </w:p>
+        </w:tc>
+      </w:tr>
+      <w:tr>
+        <w:tc>
+          <w:tcPr>
+            <w:tcW w:type="dxa" w:w="2200"/>
+            <w:shd w:fill="E8F0F7" w:val="clear"/>
+          </w:tcPr>
+          <w:p>
+            <w:r>
+              <w:rPr>
+                <w:b/>
+              </w:rPr>
+              <w:t>Zip Code</w:t>
+            </w:r>
+          </w:p>
+        </w:tc>
+        <w:tc>
+          <w:tcPr>
+            <w:tcW w:type="dxa" w:w="1400"/>
+            <w:shd w:fill="E8F0F7" w:val="clear"/>
+          </w:tcPr>
+          <w:p>
+            <w:r>
+              <w:t>Yes</w:t>
+            </w:r>
+          </w:p>
+        </w:tc>
+        <w:tc>
+          <w:tcPr>
+            <w:tcW w:type="dxa" w:w="5760"/>
+            <w:shd w:fill="E8F0F7" w:val="clear"/>
+          </w:tcPr>
+          <w:p>
+            <w:r>
+              <w:t xml:space="preserve">Text field. Populates Contact record. Used for geographic reporting.</w:t>
+            </w:r>
+          </w:p>
+        </w:tc>
+      </w:tr>
+      <w:tr>
+        <w:tc>
+          <w:tcPr>
+            <w:tcW w:type="dxa" w:w="2200"/>
+          </w:tcPr>
+          <w:p>
+            <w:r>
+              <w:rPr>
+                <w:b/>
+              </w:rPr>
+              <w:t>Business Name</w:t>
+            </w:r>
+          </w:p>
+        </w:tc>
+        <w:tc>
+          <w:tcPr>
+            <w:tcW w:type="dxa" w:w="1400"/>
+          </w:tcPr>
+          <w:p>
+            <w:r>
+              <w:t>No</w:t>
+            </w:r>
+          </w:p>
+        </w:tc>
+        <w:tc>
+          <w:tcPr>
+            <w:tcW w:type="dxa" w:w="5760"/>
+          </w:tcPr>
+          <w:p>
+            <w:r>
+              <w:t xml:space="preserve">Text field. Populates Company record. May be left blank for pre-startup applicants who have not yet named their business.</w:t>
+            </w:r>
+          </w:p>
+        </w:tc>
+      </w:tr>
+      <w:tr>
+        <w:tc>
+          <w:tcPr>
+            <w:tcW w:type="dxa" w:w="2200"/>
+            <w:shd w:fill="E8F0F7" w:val="clear"/>
+          </w:tcPr>
+          <w:p>
+            <w:r>
+              <w:rPr>
+                <w:b/>
+              </w:rPr>
+              <w:t>Website</w:t>
+            </w:r>
+          </w:p>
+        </w:tc>
+        <w:tc>
+          <w:tcPr>
+            <w:tcW w:type="dxa" w:w="1400"/>
+            <w:shd w:fill="E8F0F7" w:val="clear"/>
+          </w:tcPr>
+          <w:p>
+            <w:r>
+              <w:t>No</w:t>
+            </w:r>
+          </w:p>
+        </w:tc>
+        <w:tc>
+          <w:tcPr>
+            <w:tcW w:type="dxa" w:w="5760"/>
+            <w:shd w:fill="E8F0F7" w:val="clear"/>
+          </w:tcPr>
+          <w:p>
+            <w:r>
+              <w:t xml:space="preserve">URL field. Populates Company record.</w:t>
+            </w:r>
+          </w:p>
+        </w:tc>
+      </w:tr>
+      <w:tr>
+        <w:tc>
+          <w:tcPr>
+            <w:tcW w:type="dxa" w:w="2200"/>
+          </w:tcPr>
+          <w:p>
+            <w:r>
+              <w:rPr>
+                <w:b/>
+              </w:rPr>
+              <w:t>Address</w:t>
+            </w:r>
+          </w:p>
+        </w:tc>
+        <w:tc>
+          <w:tcPr>
+            <w:tcW w:type="dxa" w:w="1400"/>
+          </w:tcPr>
+          <w:p>
+            <w:r>
+              <w:t>No</w:t>
+            </w:r>
+          </w:p>
+        </w:tc>
+        <w:tc>
+          <w:tcPr>
+            <w:tcW w:type="dxa" w:w="5760"/>
+          </w:tcPr>
+          <w:p>
+            <w:r>
+              <w:t xml:space="preserve">Address field (street, city, state, zip). Populates Company record.</w:t>
+            </w:r>
+          </w:p>
+        </w:tc>
+      </w:tr>
+      <w:tr>
+        <w:tc>
+          <w:tcPr>
+            <w:tcW w:type="dxa" w:w="2200"/>
+            <w:shd w:fill="E8F0F7" w:val="clear"/>
+          </w:tcPr>
+          <w:p>
+            <w:r>
+              <w:rPr>
+                <w:b/>
+              </w:rPr>
+              <w:t>Organization Type</w:t>
+            </w:r>
+          </w:p>
+        </w:tc>
+        <w:tc>
+          <w:tcPr>
+            <w:tcW w:type="dxa" w:w="1400"/>
+            <w:shd w:fill="E8F0F7" w:val="clear"/>
+          </w:tcPr>
+          <w:p>
+            <w:r>
+              <w:t>Yes</w:t>
+            </w:r>
+          </w:p>
+        </w:tc>
+        <w:tc>
+          <w:tcPr>
+            <w:tcW w:type="dxa" w:w="5760"/>
+            <w:shd w:fill="E8F0F7" w:val="clear"/>
+          </w:tcPr>
+          <w:p>
+            <w:r>
+              <w:t xml:space="preserve">Dropdown. Values: For-Profit | Non-Profit. Populates Company record.</w:t>
+            </w:r>
+          </w:p>
+        </w:tc>
+      </w:tr>
+      <w:tr>
+        <w:tc>
+          <w:tcPr>
+            <w:tcW w:type="dxa" w:w="2200"/>
+          </w:tcPr>
+          <w:p>
+            <w:r>
+              <w:rPr>
+                <w:b/>
+              </w:rPr>
+              <w:t>Business Stage</w:t>
+            </w:r>
+          </w:p>
+        </w:tc>
+        <w:tc>
+          <w:tcPr>
+            <w:tcW w:type="dxa" w:w="1400"/>
+          </w:tcPr>
+          <w:p>
+            <w:r>
+              <w:t>Yes</w:t>
+            </w:r>
+          </w:p>
+        </w:tc>
+        <w:tc>
+          <w:tcPr>
+            <w:tcW w:type="dxa" w:w="5760"/>
+          </w:tcPr>
+          <w:p>
+            <w:r>
+              <w:t xml:space="preserve">Dropdown. Values: Pre-Startup | Startup | Early Stage | Growth Stage | Established. Populates Company record.</w:t>
+            </w:r>
+          </w:p>
+        </w:tc>
+      </w:tr>
+      <w:tr>
+        <w:tc>
+          <w:tcPr>
+            <w:tcW w:type="dxa" w:w="2200"/>
+            <w:shd w:fill="E8F0F7" w:val="clear"/>
+          </w:tcPr>
+          <w:p>
+            <w:r>
+              <w:rPr>
+                <w:b/>
+              </w:rPr>
+              <w:t>NAICS Sector</w:t>
+            </w:r>
+          </w:p>
+        </w:tc>
+        <w:tc>
+          <w:tcPr>
+            <w:tcW w:type="dxa" w:w="1400"/>
+            <w:shd w:fill="E8F0F7" w:val="clear"/>
+          </w:tcPr>
+          <w:p>
+            <w:r>
+              <w:t>Yes</w:t>
+            </w:r>
+          </w:p>
+        </w:tc>
+        <w:tc>
+          <w:tcPr>
+            <w:tcW w:type="dxa" w:w="5760"/>
+            <w:shd w:fill="E8F0F7" w:val="clear"/>
+          </w:tcPr>
+          <w:p>
+            <w:r>
+              <w:t xml:space="preserve">Dropdown. Top-level industry classification (20 NAICS sectors). Populates Company record. Drives NAICS Subsector filter.</w:t>
+            </w:r>
+          </w:p>
+        </w:tc>
+      </w:tr>
+      <w:tr>
+        <w:tc>
+          <w:tcPr>
+            <w:tcW w:type="dxa" w:w="2200"/>
+          </w:tcPr>
+          <w:p>
+            <w:r>
+              <w:rPr>
+                <w:b/>
+              </w:rPr>
+              <w:t>NAICS Subsector</w:t>
+            </w:r>
+          </w:p>
+        </w:tc>
+        <w:tc>
+          <w:tcPr>
+            <w:tcW w:type="dxa" w:w="1400"/>
+          </w:tcPr>
+          <w:p>
+            <w:r>
+              <w:t>Yes</w:t>
+            </w:r>
+          </w:p>
+        </w:tc>
+        <w:tc>
+          <w:tcPr>
+            <w:tcW w:type="dxa" w:w="5760"/>
+          </w:tcPr>
+          <w:p>
+            <w:r>
+              <w:t xml:space="preserve">Dropdown. Filtered by selected NAICS Sector (~100 subsectors). Populates Company record.</w:t>
+            </w:r>
+          </w:p>
+        </w:tc>
+      </w:tr>
+      <w:tr>
+        <w:tc>
+          <w:tcPr>
+            <w:tcW w:type="dxa" w:w="2200"/>
+            <w:shd w:fill="E8F0F7" w:val="clear"/>
+          </w:tcPr>
+          <w:p>
+            <w:r>
+              <w:rPr>
+                <w:b/>
+              </w:rPr>
+              <w:t>Mentoring Focus Areas</w:t>
+            </w:r>
+          </w:p>
+        </w:tc>
+        <w:tc>
+          <w:tcPr>
+            <w:tcW w:type="dxa" w:w="1400"/>
+            <w:shd w:fill="E8F0F7" w:val="clear"/>
+          </w:tcPr>
+          <w:p>
+            <w:r>
+              <w:t>Yes</w:t>
+            </w:r>
+          </w:p>
+        </w:tc>
+        <w:tc>
+          <w:tcPr>
+            <w:tcW w:type="dxa" w:w="5760"/>
+            <w:shd w:fill="E8F0F7" w:val="clear"/>
+          </w:tcPr>
+          <w:p>
+            <w:r>
+              <w:t xml:space="preserve">Multi-select dropdown. Values to be defined by CBM leadership. Populates Company record. Used for mentor matching and funder reporting.</w:t>
+            </w:r>
+          </w:p>
+        </w:tc>
+      </w:tr>
+      <w:tr>
+        <w:tc>
+          <w:tcPr>
+            <w:tcW w:type="dxa" w:w="2200"/>
+          </w:tcPr>
+          <w:p>
+            <w:r>
+              <w:rPr>
+                <w:b/>
+              </w:rPr>
+              <w:t>Mentoring Needs Description</w:t>
+            </w:r>
+          </w:p>
+        </w:tc>
+        <w:tc>
+          <w:tcPr>
+            <w:tcW w:type="dxa" w:w="1400"/>
+          </w:tcPr>
+          <w:p>
+            <w:r>
+              <w:t>Yes</w:t>
+            </w:r>
+          </w:p>
+        </w:tc>
+        <w:tc>
+          <w:tcPr>
+            <w:tcW w:type="dxa" w:w="5760"/>
+          </w:tcPr>
+          <w:p>
+            <w:r>
+              <w:t xml:space="preserve">Rich text field. Free-form description of what the client is seeking in a mentoring engagement. Populates Company record.</w:t>
+            </w:r>
+          </w:p>
+        </w:tc>
+      </w:tr>
+    </w:tbl>
+    <w:p>
+      <w:pPr>
+        <w:spacing w:after="120"/>
+      </w:pPr>
+      <w:r>
+        <w:t xml:space="preserve"/>
+      </w:r>
+    </w:p>
+    <w:p>
+      <w:pPr>
+        <w:pStyle w:val="Heading2"/>
+      </w:pPr>
+      <w:r>
+        <w:t xml:space="preserve">4.2 Mentor Application Form</w:t>
+      </w:r>
+    </w:p>
+    <w:p>
+      <w:pPr>
+        <w:spacing w:after="120"/>
+      </w:pPr>
+      <w:r>
+        <w:t xml:space="preserve">The Mentor Application form is the intake channel for prospective mentors. It is a public-facing WordPress form accessible from the Volunteer / Mentor page. On submission, the form posts data to EspoCRM via the REST API and automatically creates a Contact record with Contact Type = Mentor and Mentor Status = Submitted. The new application appears immediately in the admin’s Submitted Mentor Applications list view for review.</w:t>
+      </w:r>
+    </w:p>
+    <w:p>
+      <w:pPr>
+        <w:spacing w:after="80"/>
+      </w:pPr>
+      <w:r>
+        <w:rPr>
+          <w:b/>
+        </w:rPr>
+        <w:t xml:space="preserve">Post-Submission Behavior</w:t>
+      </w:r>
+    </w:p>
+    <w:p>
+      <w:pPr>
+        <w:pStyle w:val="ListParagraph"/>
+        <w:numPr>
+          <w:ilvl w:val="0"/>
+          <w:numId w:val="2"/>
+        </w:numPr>
+        <w:spacing w:after="60"/>
+      </w:pPr>
+      <w:r>
+        <w:t xml:space="preserve">EspoCRM creates a Contact record (Contact Type = Mentor, Mentor Status = Submitted) with all submitted field values populated</w:t>
+      </w:r>
+    </w:p>
+    <w:p>
+      <w:pPr>
+        <w:pStyle w:val="ListParagraph"/>
+        <w:numPr>
+          <w:ilvl w:val="0"/>
+          <w:numId w:val="2"/>
+        </w:numPr>
+        <w:spacing w:after="60"/>
+      </w:pPr>
+      <w:r>
+        <w:t xml:space="preserve">Terms &amp; Conditions Accepted is set to Yes and Terms &amp; Conditions Acceptance Date/Time is set to the submission timestamp</w:t>
+      </w:r>
+    </w:p>
+    <w:p>
+      <w:pPr>
+        <w:pStyle w:val="ListParagraph"/>
+        <w:numPr>
+          <w:ilvl w:val="0"/>
+          <w:numId w:val="2"/>
+        </w:numPr>
+        <w:spacing w:after="60"/>
+      </w:pPr>
+      <w:r>
+        <w:t xml:space="preserve">Applicant receives a confirmation email to their personal email address acknowledging receipt and advising they will be contacted shortly</w:t>
+      </w:r>
+    </w:p>
+    <w:p>
+      <w:pPr>
+        <w:pStyle w:val="ListParagraph"/>
+        <w:numPr>
+          <w:ilvl w:val="0"/>
+          <w:numId w:val="2"/>
+        </w:numPr>
+        <w:spacing w:after="60"/>
+      </w:pPr>
+      <w:r>
+        <w:t xml:space="preserve">Admin receives an automatic system notification of the new application</w:t>
+      </w:r>
+    </w:p>
+    <w:p>
+      <w:pPr>
+        <w:pStyle w:val="ListParagraph"/>
+        <w:numPr>
+          <w:ilvl w:val="0"/>
+          <w:numId w:val="2"/>
+        </w:numPr>
+        <w:spacing w:after="60"/>
+      </w:pPr>
+      <w:r>
+        <w:t xml:space="preserve">If approved after review, admin changes Mentor Status to Provisional and begins the activation workflow</w:t>
+      </w:r>
+    </w:p>
+    <w:p>
+      <w:pPr>
+        <w:pStyle w:val="ListParagraph"/>
+        <w:numPr>
+          <w:ilvl w:val="0"/>
+          <w:numId w:val="2"/>
+        </w:numPr>
+        <w:spacing w:after="60"/>
+      </w:pPr>
+      <w:r>
+        <w:t xml:space="preserve">If declined after review, admin changes Mentor Status to Declined and notifies the applicant manually. No automated notification is sent. The Contact record is retained permanently for historical reference.</w:t>
+      </w:r>
+    </w:p>
+    <w:p>
+      <w:pPr>
+        <w:spacing w:after="80"/>
+      </w:pPr>
+      <w:r>
+        <w:rPr>
+          <w:b/>
+        </w:rPr>
+        <w:t xml:space="preserve">Form Fields</w:t>
+      </w:r>
+    </w:p>
+    <w:p>
+      <w:pPr>
+        <w:spacing w:after="60"/>
+      </w:pPr>
+      <w:r>
+        <w:t xml:space="preserve">The following fields are collected on the form. All fields populate the Contact record. Fields marked Required must be completed before the form can be submitted.</w:t>
+      </w:r>
+    </w:p>
+    <w:tbl>
+      <w:tblPr>
+        <w:tblW w:type="dxa" w:w="9360"/>
+        <w:tblBorders>
+          <w:top w:val="single" w:color="CCCCCC" w:sz="4"/>
+          <w:left w:val="single" w:color="CCCCCC" w:sz="4"/>
+          <w:bottom w:val="single" w:color="CCCCCC" w:sz="4"/>
+          <w:right w:val="single" w:color="CCCCCC" w:sz="4"/>
+          <w:insideH w:val="single" w:color="CCCCCC" w:sz="4"/>
+          <w:insideV w:val="single" w:color="CCCCCC" w:sz="4"/>
+        </w:tblBorders>
+        <w:tblCellMar>
+          <w:top w:type="dxa" w:w="80"/>
+          <w:left w:type="dxa" w:w="120"/>
+          <w:bottom w:type="dxa" w:w="80"/>
+          <w:right w:type="dxa" w:w="120"/>
+        </w:tblCellMar>
+      </w:tblPr>
+      <w:tblGrid>
+        <w:gridCol w:w="2200"/>
+        <w:gridCol w:w="1400"/>
+        <w:gridCol w:w="5760"/>
+      </w:tblGrid>
+      <w:tr>
+        <w:trPr>
+          <w:tblHeader/>
+        </w:trPr>
+        <w:tc>
+          <w:tcPr>
+            <w:tcW w:type="dxa" w:w="2200"/>
+            <w:shd w:fill="2C5F8A" w:val="clear"/>
+          </w:tcPr>
+          <w:p>
+            <w:r>
+              <w:rPr>
+                <w:b/>
+                <w:color w:val="FFFFFF"/>
+              </w:rPr>
+              <w:t>Field</w:t>
+            </w:r>
+          </w:p>
+        </w:tc>
+        <w:tc>
+          <w:tcPr>
+            <w:tcW w:type="dxa" w:w="1400"/>
+            <w:shd w:fill="2C5F8A" w:val="clear"/>
+          </w:tcPr>
+          <w:p>
+            <w:r>
+              <w:rPr>
+                <w:b/>
+                <w:color w:val="FFFFFF"/>
+              </w:rPr>
+              <w:t>Required</w:t>
+            </w:r>
+          </w:p>
+        </w:tc>
+        <w:tc>
+          <w:tcPr>
+            <w:tcW w:type="dxa" w:w="5760"/>
+            <w:shd w:fill="2C5F8A" w:val="clear"/>
+          </w:tcPr>
+          <w:p>
+            <w:r>
+              <w:rPr>
+                <w:b/>
+                <w:color w:val="FFFFFF"/>
+              </w:rPr>
+              <w:t>Description / Notes</w:t>
+            </w:r>
+          </w:p>
+        </w:tc>
+      </w:tr>
+      <w:tr>
+        <w:tc>
+          <w:tcPr>
+            <w:tcW w:type="dxa" w:w="2200"/>
+            <w:shd w:fill="E8F0F7" w:val="clear"/>
+          </w:tcPr>
+          <w:p>
+            <w:r>
+              <w:rPr>
+                <w:b/>
+              </w:rPr>
+              <w:t>First Name</w:t>
+            </w:r>
+          </w:p>
+        </w:tc>
+        <w:tc>
+          <w:tcPr>
+            <w:tcW w:type="dxa" w:w="1400"/>
+            <w:shd w:fill="E8F0F7" w:val="clear"/>
+          </w:tcPr>
+          <w:p>
+            <w:r>
+              <w:t>Yes</w:t>
+            </w:r>
+          </w:p>
+        </w:tc>
+        <w:tc>
+          <w:tcPr>
+            <w:tcW w:type="dxa" w:w="5760"/>
+            <w:shd w:fill="E8F0F7" w:val="clear"/>
+          </w:tcPr>
+          <w:p>
+            <w:r>
+              <w:t>Text field.</w:t>
+            </w:r>
+          </w:p>
+        </w:tc>
+      </w:tr>
+      <w:tr>
+        <w:tc>
+          <w:tcPr>
+            <w:tcW w:type="dxa" w:w="2200"/>
+          </w:tcPr>
+          <w:p>
+            <w:r>
+              <w:rPr>
+                <w:b/>
+              </w:rPr>
+              <w:t>Middle Name</w:t>
+            </w:r>
+          </w:p>
+        </w:tc>
+        <w:tc>
+          <w:tcPr>
+            <w:tcW w:type="dxa" w:w="1400"/>
+          </w:tcPr>
+          <w:p>
+            <w:r>
+              <w:t>No</w:t>
+            </w:r>
+          </w:p>
+        </w:tc>
+        <w:tc>
+          <w:tcPr>
+            <w:tcW w:type="dxa" w:w="5760"/>
+          </w:tcPr>
+          <w:p>
+            <w:r>
+              <w:t>Text field.</w:t>
+            </w:r>
+          </w:p>
+        </w:tc>
+      </w:tr>
+      <w:tr>
+        <w:tc>
+          <w:tcPr>
+            <w:tcW w:type="dxa" w:w="2200"/>
+            <w:shd w:fill="E8F0F7" w:val="clear"/>
+          </w:tcPr>
+          <w:p>
+            <w:r>
+              <w:rPr>
+                <w:b/>
+              </w:rPr>
+              <w:t>Last Name</w:t>
+            </w:r>
+          </w:p>
+        </w:tc>
+        <w:tc>
+          <w:tcPr>
+            <w:tcW w:type="dxa" w:w="1400"/>
+            <w:shd w:fill="E8F0F7" w:val="clear"/>
+          </w:tcPr>
+          <w:p>
+            <w:r>
+              <w:t>Yes</w:t>
+            </w:r>
+          </w:p>
+        </w:tc>
+        <w:tc>
+          <w:tcPr>
+            <w:tcW w:type="dxa" w:w="5760"/>
+            <w:shd w:fill="E8F0F7" w:val="clear"/>
+          </w:tcPr>
+          <w:p>
+            <w:r>
+              <w:t>Text field.</w:t>
+            </w:r>
+          </w:p>
+        </w:tc>
+      </w:tr>
+      <w:tr>
+        <w:tc>
+          <w:tcPr>
+            <w:tcW w:type="dxa" w:w="2200"/>
+          </w:tcPr>
+          <w:p>
+            <w:r>
+              <w:rPr>
+                <w:b/>
+              </w:rPr>
+              <w:t>Preferred Name</w:t>
+            </w:r>
+          </w:p>
+        </w:tc>
+        <w:tc>
+          <w:tcPr>
+            <w:tcW w:type="dxa" w:w="1400"/>
+          </w:tcPr>
+          <w:p>
+            <w:r>
+              <w:t>No</w:t>
+            </w:r>
+          </w:p>
+        </w:tc>
+        <w:tc>
+          <w:tcPr>
+            <w:tcW w:type="dxa" w:w="5760"/>
+          </w:tcPr>
+          <w:p>
+            <w:r>
+              <w:t xml:space="preserve">Text field. The name the mentor prefers to be called. Used in communications and mentor profile.</w:t>
+            </w:r>
+          </w:p>
+        </w:tc>
+      </w:tr>
+      <w:tr>
+        <w:tc>
+          <w:tcPr>
+            <w:tcW w:type="dxa" w:w="2200"/>
+            <w:shd w:fill="E8F0F7" w:val="clear"/>
+          </w:tcPr>
+          <w:p>
+            <w:r>
+              <w:rPr>
+                <w:b/>
+              </w:rPr>
+              <w:t>Personal Email</w:t>
+            </w:r>
+          </w:p>
+        </w:tc>
+        <w:tc>
+          <w:tcPr>
+            <w:tcW w:type="dxa" w:w="1400"/>
+            <w:shd w:fill="E8F0F7" w:val="clear"/>
+          </w:tcPr>
+          <w:p>
+            <w:r>
+              <w:t>Yes</w:t>
+            </w:r>
+          </w:p>
+        </w:tc>
+        <w:tc>
+          <w:tcPr>
+            <w:tcW w:type="dxa" w:w="5760"/>
+            <w:shd w:fill="E8F0F7" w:val="clear"/>
+          </w:tcPr>
+          <w:p>
+            <w:r>
+              <w:t xml:space="preserve">Email field. The applicant’s personal email — not a CBM Gmail address. Used for all onboarding communications prior to CBM Gmail activation.</w:t>
+            </w:r>
+          </w:p>
+        </w:tc>
+      </w:tr>
+      <w:tr>
+        <w:tc>
+          <w:tcPr>
+            <w:tcW w:type="dxa" w:w="2200"/>
+          </w:tcPr>
+          <w:p>
+            <w:r>
+              <w:rPr>
+                <w:b/>
+              </w:rPr>
+              <w:t>Phone</w:t>
+            </w:r>
+          </w:p>
+        </w:tc>
+        <w:tc>
+          <w:tcPr>
+            <w:tcW w:type="dxa" w:w="1400"/>
+          </w:tcPr>
+          <w:p>
+            <w:r>
+              <w:t>No</w:t>
+            </w:r>
+          </w:p>
+        </w:tc>
+        <w:tc>
+          <w:tcPr>
+            <w:tcW w:type="dxa" w:w="5760"/>
+          </w:tcPr>
+          <w:p>
+            <w:r>
+              <w:t>Phone field.</w:t>
+            </w:r>
+          </w:p>
+        </w:tc>
+      </w:tr>
+      <w:tr>
+        <w:tc>
+          <w:tcPr>
+            <w:tcW w:type="dxa" w:w="2200"/>
+            <w:shd w:fill="E8F0F7" w:val="clear"/>
+          </w:tcPr>
+          <w:p>
+            <w:r>
+              <w:rPr>
+                <w:b/>
+              </w:rPr>
+              <w:t>Street Address</w:t>
+            </w:r>
+          </w:p>
+        </w:tc>
+        <w:tc>
+          <w:tcPr>
+            <w:tcW w:type="dxa" w:w="1400"/>
+            <w:shd w:fill="E8F0F7" w:val="clear"/>
+          </w:tcPr>
+          <w:p>
+            <w:r>
+              <w:t>No</w:t>
+            </w:r>
+          </w:p>
+        </w:tc>
+        <w:tc>
+          <w:tcPr>
+            <w:tcW w:type="dxa" w:w="5760"/>
+            <w:shd w:fill="E8F0F7" w:val="clear"/>
+          </w:tcPr>
+          <w:p>
+            <w:r>
+              <w:t xml:space="preserve">Address field (street, city, state, zip).</w:t>
+            </w:r>
+          </w:p>
+        </w:tc>
+      </w:tr>
+      <w:tr>
+        <w:tc>
+          <w:tcPr>
+            <w:tcW w:type="dxa" w:w="2200"/>
+          </w:tcPr>
+          <w:p>
+            <w:r>
+              <w:rPr>
+                <w:b/>
+              </w:rPr>
+              <w:t>LinkedIn Profile URL</w:t>
+            </w:r>
+          </w:p>
+        </w:tc>
+        <w:tc>
+          <w:tcPr>
+            <w:tcW w:type="dxa" w:w="1400"/>
+          </w:tcPr>
+          <w:p>
+            <w:r>
+              <w:t>No</w:t>
+            </w:r>
+          </w:p>
+        </w:tc>
+        <w:tc>
+          <w:tcPr>
+            <w:tcW w:type="dxa" w:w="5760"/>
+          </w:tcPr>
+          <w:p>
+            <w:r>
+              <w:t>URL field.</w:t>
+            </w:r>
+          </w:p>
+        </w:tc>
+      </w:tr>
+      <w:tr>
+        <w:tc>
+          <w:tcPr>
+            <w:tcW w:type="dxa" w:w="2200"/>
+            <w:shd w:fill="E8F0F7" w:val="clear"/>
+          </w:tcPr>
+          <w:p>
+            <w:r>
+              <w:rPr>
+                <w:b/>
+              </w:rPr>
+              <w:t>Currently Employed</w:t>
+            </w:r>
+          </w:p>
+        </w:tc>
+        <w:tc>
+          <w:tcPr>
+            <w:tcW w:type="dxa" w:w="1400"/>
+            <w:shd w:fill="E8F0F7" w:val="clear"/>
+          </w:tcPr>
+          <w:p>
+            <w:r>
+              <w:t>No</w:t>
+            </w:r>
+          </w:p>
+        </w:tc>
+        <w:tc>
+          <w:tcPr>
+            <w:tcW w:type="dxa" w:w="5760"/>
+            <w:shd w:fill="E8F0F7" w:val="clear"/>
+          </w:tcPr>
+          <w:p>
+            <w:r>
+              <w:t xml:space="preserve">Checkbox. Whether the applicant is currently employed at time of application.</w:t>
+            </w:r>
+          </w:p>
+        </w:tc>
+      </w:tr>
+      <w:tr>
+        <w:tc>
+          <w:tcPr>
+            <w:tcW w:type="dxa" w:w="2200"/>
+          </w:tcPr>
+          <w:p>
+            <w:r>
+              <w:rPr>
+                <w:b/>
+              </w:rPr>
+              <w:t>Professional Bio / Work Experience</w:t>
+            </w:r>
+          </w:p>
+        </w:tc>
+        <w:tc>
+          <w:tcPr>
+            <w:tcW w:type="dxa" w:w="1400"/>
+          </w:tcPr>
+          <w:p>
+            <w:r>
+              <w:t>No</w:t>
+            </w:r>
+          </w:p>
+        </w:tc>
+        <w:tc>
+          <w:tcPr>
+            <w:tcW w:type="dxa" w:w="5760"/>
+          </w:tcPr>
+          <w:p>
+            <w:r>
+              <w:t xml:space="preserve">Rich text field. Free-form description of professional background and work experience. Used for mentor profiles and matching.</w:t>
+            </w:r>
+          </w:p>
+        </w:tc>
+      </w:tr>
+      <w:tr>
+        <w:tc>
+          <w:tcPr>
+            <w:tcW w:type="dxa" w:w="2200"/>
+            <w:shd w:fill="E8F0F7" w:val="clear"/>
+          </w:tcPr>
+          <w:p>
+            <w:r>
+              <w:rPr>
+                <w:b/>
+              </w:rPr>
+              <w:t>Industry Experience and Expertise</w:t>
+            </w:r>
+          </w:p>
+        </w:tc>
+        <w:tc>
+          <w:tcPr>
+            <w:tcW w:type="dxa" w:w="1400"/>
+            <w:shd w:fill="E8F0F7" w:val="clear"/>
+          </w:tcPr>
+          <w:p>
+            <w:r>
+              <w:t>No</w:t>
+            </w:r>
+          </w:p>
+        </w:tc>
+        <w:tc>
+          <w:tcPr>
+            <w:tcW w:type="dxa" w:w="5760"/>
+            <w:shd w:fill="E8F0F7" w:val="clear"/>
+          </w:tcPr>
+          <w:p>
+            <w:r>
+              <w:t xml:space="preserve">Multi-select dropdown. Maps to NAICS Sectors and Skills &amp; Expertise Tags on the Contact record. Values TBD.</w:t>
+            </w:r>
+          </w:p>
+        </w:tc>
+      </w:tr>
+      <w:tr>
+        <w:tc>
+          <w:tcPr>
+            <w:tcW w:type="dxa" w:w="2200"/>
+          </w:tcPr>
+          <w:p>
+            <w:r>
+              <w:rPr>
+                <w:b/>
+              </w:rPr>
+              <w:t>Fluent Languages</w:t>
+            </w:r>
+          </w:p>
+        </w:tc>
+        <w:tc>
+          <w:tcPr>
+            <w:tcW w:type="dxa" w:w="1400"/>
+          </w:tcPr>
+          <w:p>
+            <w:r>
+              <w:t>No</w:t>
+            </w:r>
+          </w:p>
+        </w:tc>
+        <w:tc>
+          <w:tcPr>
+            <w:tcW w:type="dxa" w:w="5760"/>
+          </w:tcPr>
+          <w:p>
+            <w:r>
+              <w:t xml:space="preserve">Multi-select dropdown. Languages the applicant is fluent in. Values TBD.</w:t>
+            </w:r>
+          </w:p>
+        </w:tc>
+      </w:tr>
+      <w:tr>
+        <w:tc>
+          <w:tcPr>
+            <w:tcW w:type="dxa" w:w="2200"/>
+            <w:shd w:fill="E8F0F7" w:val="clear"/>
+          </w:tcPr>
+          <w:p>
+            <w:r>
+              <w:rPr>
+                <w:b/>
+              </w:rPr>
+              <w:t>Why Interested in Mentoring</w:t>
+            </w:r>
+          </w:p>
+        </w:tc>
+        <w:tc>
+          <w:tcPr>
+            <w:tcW w:type="dxa" w:w="1400"/>
+            <w:shd w:fill="E8F0F7" w:val="clear"/>
+          </w:tcPr>
+          <w:p>
+            <w:r>
+              <w:t>No</w:t>
+            </w:r>
+          </w:p>
+        </w:tc>
+        <w:tc>
+          <w:tcPr>
+            <w:tcW w:type="dxa" w:w="5760"/>
+            <w:shd w:fill="E8F0F7" w:val="clear"/>
+          </w:tcPr>
+          <w:p>
+            <w:r>
+              <w:t xml:space="preserve">Rich text field. The applicant’s stated motivation for joining CBM as a mentor.</w:t>
+            </w:r>
+          </w:p>
+        </w:tc>
+      </w:tr>
+      <w:tr>
+        <w:tc>
+          <w:tcPr>
+            <w:tcW w:type="dxa" w:w="2200"/>
+          </w:tcPr>
+          <w:p>
+            <w:r>
+              <w:rPr>
+                <w:b/>
+              </w:rPr>
+              <w:t>How Did You Hear About CBM</w:t>
+            </w:r>
+          </w:p>
+        </w:tc>
+        <w:tc>
+          <w:tcPr>
+            <w:tcW w:type="dxa" w:w="1400"/>
+          </w:tcPr>
+          <w:p>
+            <w:r>
+              <w:t>No</w:t>
+            </w:r>
+          </w:p>
+        </w:tc>
+        <w:tc>
+          <w:tcPr>
+            <w:tcW w:type="dxa" w:w="5760"/>
+          </w:tcPr>
+          <w:p>
+            <w:r>
+              <w:t xml:space="preserve">Dropdown. Values TBD. Used for outreach and referral tracking.</w:t>
+            </w:r>
+          </w:p>
+        </w:tc>
+      </w:tr>
+      <w:tr>
+        <w:tc>
+          <w:tcPr>
+            <w:tcW w:type="dxa" w:w="2200"/>
+            <w:shd w:fill="E8F0F7" w:val="clear"/>
+          </w:tcPr>
+          <w:p>
+            <w:r>
+              <w:rPr>
+                <w:b/>
+              </w:rPr>
+              <w:t>Felony Conviction Disclosure</w:t>
+            </w:r>
+          </w:p>
+        </w:tc>
+        <w:tc>
+          <w:tcPr>
+            <w:tcW w:type="dxa" w:w="1400"/>
+            <w:shd w:fill="E8F0F7" w:val="clear"/>
+          </w:tcPr>
+          <w:p>
+            <w:r>
+              <w:t>Yes</w:t>
+            </w:r>
+          </w:p>
+        </w:tc>
+        <w:tc>
+          <w:tcPr>
+            <w:tcW w:type="dxa" w:w="5760"/>
+            <w:shd w:fill="E8F0F7" w:val="clear"/>
+          </w:tcPr>
+          <w:p>
+            <w:r>
+              <w:t xml:space="preserve">Checkbox or Yes/No field. Required disclosure. Reviewed by admin during application screening.</w:t>
+            </w:r>
+          </w:p>
+        </w:tc>
+      </w:tr>
+      <w:tr>
+        <w:tc>
+          <w:tcPr>
+            <w:tcW w:type="dxa" w:w="2200"/>
+          </w:tcPr>
+          <w:p>
+            <w:r>
+              <w:rPr>
+                <w:b/>
+              </w:rPr>
+              <w:t>Terms &amp; Conditions Acceptance</w:t>
+            </w:r>
+          </w:p>
+        </w:tc>
+        <w:tc>
+          <w:tcPr>
+            <w:tcW w:type="dxa" w:w="1400"/>
+          </w:tcPr>
+          <w:p>
+            <w:r>
+              <w:t>Yes</w:t>
+            </w:r>
+          </w:p>
+        </w:tc>
+        <w:tc>
+          <w:tcPr>
+            <w:tcW w:type="dxa" w:w="5760"/>
+          </w:tcPr>
+          <w:p>
+            <w:r>
+              <w:t xml:space="preserve">Checkbox. Must be checked before form can be submitted. Sets Terms &amp; Conditions Accepted = Yes and records the acceptance timestamp on the Contact record.</w:t>
+            </w:r>
+          </w:p>
+        </w:tc>
+      </w:tr>
+    </w:tbl>
+    <w:p>
+      <w:pPr>
+        <w:spacing w:after="120"/>
+      </w:pPr>
       <w:r>
         <w:t xml:space="preserve"/>
       </w:r>

</xml_diff>

<commit_message>
Add CBM-PRD-Forms.docx; remove form sections 4.1/4.2 from website PRD
</commit_message>
<xml_diff>
--- a/PRDs/CBM-PRD-Website.docx
+++ b/PRDs/CBM-PRD-Website.docx
@@ -514,1485 +514,6 @@
       </w:r>
     </w:p>
     <w:p>
-      <w:r>
-        <w:t xml:space="preserve"/>
-      </w:r>
-    </w:p>
-    <w:p>
-      <w:pPr>
-        <w:pStyle w:val="Heading2"/>
-      </w:pPr>
-      <w:r>
-        <w:t xml:space="preserve">4.1 Client Mentoring Request Form</w:t>
-      </w:r>
-    </w:p>
-    <w:p>
-      <w:pPr>
-        <w:spacing w:after="120"/>
-      </w:pPr>
-      <w:r>
-        <w:t xml:space="preserve">The Client Mentoring Request form is the primary intake channel for prospective clients. It is a public-facing WordPress form accessible from the Get Mentoring page. On submission, the form posts data to EspoCRM via the REST API and automatically creates three linked records: a Company record (the business), a Contact record (the submitting individual, flagged as Primary Contact), and an Engagement record with Status = Submitted. The new submission appears immediately in the admin’s Submitted Engagements list view for review and assignment.</w:t>
-      </w:r>
-    </w:p>
-    <w:p>
-      <w:pPr>
-        <w:spacing w:after="80"/>
-      </w:pPr>
-      <w:r>
-        <w:rPr>
-          <w:b/>
-        </w:rPr>
-        <w:t xml:space="preserve">Post-Submission Behavior</w:t>
-      </w:r>
-    </w:p>
-    <w:p>
-      <w:pPr>
-        <w:pStyle w:val="ListParagraph"/>
-        <w:numPr>
-          <w:ilvl w:val="0"/>
-          <w:numId w:val="2"/>
-        </w:numPr>
-        <w:spacing w:after="60"/>
-      </w:pPr>
-      <w:r>
-        <w:t xml:space="preserve">EspoCRM creates linked Company, Contact, and Engagement records (Engagement Status = Submitted)</w:t>
-      </w:r>
-    </w:p>
-    <w:p>
-      <w:pPr>
-        <w:pStyle w:val="ListParagraph"/>
-        <w:numPr>
-          <w:ilvl w:val="0"/>
-          <w:numId w:val="2"/>
-        </w:numPr>
-        <w:spacing w:after="60"/>
-      </w:pPr>
-      <w:r>
-        <w:t xml:space="preserve">Admin receives an automatic system notification of the new submission</w:t>
-      </w:r>
-    </w:p>
-    <w:p>
-      <w:pPr>
-        <w:pStyle w:val="ListParagraph"/>
-        <w:numPr>
-          <w:ilvl w:val="0"/>
-          <w:numId w:val="2"/>
-        </w:numPr>
-        <w:spacing w:after="60"/>
-      </w:pPr>
-      <w:r>
-        <w:t xml:space="preserve">Submitter receives a confirmation email acknowledging receipt of their request</w:t>
-      </w:r>
-    </w:p>
-    <w:p>
-      <w:pPr>
-        <w:pStyle w:val="ListParagraph"/>
-        <w:numPr>
-          <w:ilvl w:val="0"/>
-          <w:numId w:val="2"/>
-        </w:numPr>
-        <w:spacing w:after="60"/>
-      </w:pPr>
-      <w:r>
-        <w:t xml:space="preserve">If the request is declined after admin review, Engagement Status is set to Declined and the admin notifies the applicant manually</w:t>
-      </w:r>
-    </w:p>
-    <w:p>
-      <w:pPr>
-        <w:spacing w:after="80"/>
-      </w:pPr>
-      <w:r>
-        <w:rPr>
-          <w:b/>
-        </w:rPr>
-        <w:t xml:space="preserve">Form Fields</w:t>
-      </w:r>
-    </w:p>
-    <w:p>
-      <w:pPr>
-        <w:spacing w:after="60"/>
-      </w:pPr>
-      <w:r>
-        <w:t xml:space="preserve">The following fields are collected on the form. Fields marked Required must be completed before the form can be submitted. Contact record fields are noted; all remaining fields populate the Company record.</w:t>
-      </w:r>
-    </w:p>
-    <w:tbl>
-      <w:tblPr>
-        <w:tblW w:type="dxa" w:w="9360"/>
-        <w:tblBorders>
-          <w:top w:val="single" w:color="CCCCCC" w:sz="4"/>
-          <w:left w:val="single" w:color="CCCCCC" w:sz="4"/>
-          <w:bottom w:val="single" w:color="CCCCCC" w:sz="4"/>
-          <w:right w:val="single" w:color="CCCCCC" w:sz="4"/>
-          <w:insideH w:val="single" w:color="CCCCCC" w:sz="4"/>
-          <w:insideV w:val="single" w:color="CCCCCC" w:sz="4"/>
-        </w:tblBorders>
-        <w:tblCellMar>
-          <w:top w:type="dxa" w:w="80"/>
-          <w:left w:type="dxa" w:w="120"/>
-          <w:bottom w:type="dxa" w:w="80"/>
-          <w:right w:type="dxa" w:w="120"/>
-        </w:tblCellMar>
-      </w:tblPr>
-      <w:tblGrid>
-        <w:gridCol w:w="2200"/>
-        <w:gridCol w:w="1400"/>
-        <w:gridCol w:w="5760"/>
-      </w:tblGrid>
-      <w:tr>
-        <w:trPr>
-          <w:tblHeader/>
-        </w:trPr>
-        <w:tc>
-          <w:tcPr>
-            <w:tcW w:type="dxa" w:w="2200"/>
-            <w:shd w:fill="2C5F8A" w:val="clear"/>
-          </w:tcPr>
-          <w:p>
-            <w:r>
-              <w:rPr>
-                <w:b/>
-                <w:color w:val="FFFFFF"/>
-              </w:rPr>
-              <w:t>Field</w:t>
-            </w:r>
-          </w:p>
-        </w:tc>
-        <w:tc>
-          <w:tcPr>
-            <w:tcW w:type="dxa" w:w="1400"/>
-            <w:shd w:fill="2C5F8A" w:val="clear"/>
-          </w:tcPr>
-          <w:p>
-            <w:r>
-              <w:rPr>
-                <w:b/>
-                <w:color w:val="FFFFFF"/>
-              </w:rPr>
-              <w:t>Required</w:t>
-            </w:r>
-          </w:p>
-        </w:tc>
-        <w:tc>
-          <w:tcPr>
-            <w:tcW w:type="dxa" w:w="5760"/>
-            <w:shd w:fill="2C5F8A" w:val="clear"/>
-          </w:tcPr>
-          <w:p>
-            <w:r>
-              <w:rPr>
-                <w:b/>
-                <w:color w:val="FFFFFF"/>
-              </w:rPr>
-              <w:t>Description / Notes</w:t>
-            </w:r>
-          </w:p>
-        </w:tc>
-      </w:tr>
-      <w:tr>
-        <w:tc>
-          <w:tcPr>
-            <w:tcW w:type="dxa" w:w="2200"/>
-            <w:shd w:fill="E8F0F7" w:val="clear"/>
-          </w:tcPr>
-          <w:p>
-            <w:r>
-              <w:rPr>
-                <w:b/>
-              </w:rPr>
-              <w:t>First Name</w:t>
-            </w:r>
-          </w:p>
-        </w:tc>
-        <w:tc>
-          <w:tcPr>
-            <w:tcW w:type="dxa" w:w="1400"/>
-          </w:tcPr>
-          <w:p>
-            <w:r>
-              <w:t>Yes</w:t>
-            </w:r>
-          </w:p>
-        </w:tc>
-        <w:tc>
-          <w:tcPr>
-            <w:tcW w:type="dxa" w:w="5760"/>
-          </w:tcPr>
-          <w:p>
-            <w:r>
-              <w:t xml:space="preserve">Text field. Populates Contact record.</w:t>
-            </w:r>
-          </w:p>
-        </w:tc>
-      </w:tr>
-      <w:tr>
-        <w:tc>
-          <w:tcPr>
-            <w:tcW w:type="dxa" w:w="2200"/>
-          </w:tcPr>
-          <w:p>
-            <w:r>
-              <w:rPr>
-                <w:b/>
-              </w:rPr>
-              <w:t>Last Name</w:t>
-            </w:r>
-          </w:p>
-        </w:tc>
-        <w:tc>
-          <w:tcPr>
-            <w:tcW w:type="dxa" w:w="1400"/>
-          </w:tcPr>
-          <w:p>
-            <w:r>
-              <w:t>Yes</w:t>
-            </w:r>
-          </w:p>
-        </w:tc>
-        <w:tc>
-          <w:tcPr>
-            <w:tcW w:type="dxa" w:w="5760"/>
-          </w:tcPr>
-          <w:p>
-            <w:r>
-              <w:t xml:space="preserve">Text field. Populates Contact record.</w:t>
-            </w:r>
-          </w:p>
-        </w:tc>
-      </w:tr>
-      <w:tr>
-        <w:tc>
-          <w:tcPr>
-            <w:tcW w:type="dxa" w:w="2200"/>
-            <w:shd w:fill="E8F0F7" w:val="clear"/>
-          </w:tcPr>
-          <w:p>
-            <w:r>
-              <w:rPr>
-                <w:b/>
-              </w:rPr>
-              <w:t>Email Address</w:t>
-            </w:r>
-          </w:p>
-        </w:tc>
-        <w:tc>
-          <w:tcPr>
-            <w:tcW w:type="dxa" w:w="1400"/>
-            <w:shd w:fill="E8F0F7" w:val="clear"/>
-          </w:tcPr>
-          <w:p>
-            <w:r>
-              <w:t>Yes</w:t>
-            </w:r>
-          </w:p>
-        </w:tc>
-        <w:tc>
-          <w:tcPr>
-            <w:tcW w:type="dxa" w:w="5760"/>
-            <w:shd w:fill="E8F0F7" w:val="clear"/>
-          </w:tcPr>
-          <w:p>
-            <w:r>
-              <w:t xml:space="preserve">Email field. Populates Contact record. Used for all follow-up communications including mentor introduction and Phase 2 form delivery.</w:t>
-            </w:r>
-          </w:p>
-        </w:tc>
-      </w:tr>
-      <w:tr>
-        <w:tc>
-          <w:tcPr>
-            <w:tcW w:type="dxa" w:w="2200"/>
-          </w:tcPr>
-          <w:p>
-            <w:r>
-              <w:rPr>
-                <w:b/>
-              </w:rPr>
-              <w:t>Phone</w:t>
-            </w:r>
-          </w:p>
-        </w:tc>
-        <w:tc>
-          <w:tcPr>
-            <w:tcW w:type="dxa" w:w="1400"/>
-          </w:tcPr>
-          <w:p>
-            <w:r>
-              <w:t>Yes</w:t>
-            </w:r>
-          </w:p>
-        </w:tc>
-        <w:tc>
-          <w:tcPr>
-            <w:tcW w:type="dxa" w:w="5760"/>
-          </w:tcPr>
-          <w:p>
-            <w:r>
-              <w:t xml:space="preserve">Phone field. Populates Contact record.</w:t>
-            </w:r>
-          </w:p>
-        </w:tc>
-      </w:tr>
-      <w:tr>
-        <w:tc>
-          <w:tcPr>
-            <w:tcW w:type="dxa" w:w="2200"/>
-            <w:shd w:fill="E8F0F7" w:val="clear"/>
-          </w:tcPr>
-          <w:p>
-            <w:r>
-              <w:rPr>
-                <w:b/>
-              </w:rPr>
-              <w:t>Zip Code</w:t>
-            </w:r>
-          </w:p>
-        </w:tc>
-        <w:tc>
-          <w:tcPr>
-            <w:tcW w:type="dxa" w:w="1400"/>
-            <w:shd w:fill="E8F0F7" w:val="clear"/>
-          </w:tcPr>
-          <w:p>
-            <w:r>
-              <w:t>Yes</w:t>
-            </w:r>
-          </w:p>
-        </w:tc>
-        <w:tc>
-          <w:tcPr>
-            <w:tcW w:type="dxa" w:w="5760"/>
-            <w:shd w:fill="E8F0F7" w:val="clear"/>
-          </w:tcPr>
-          <w:p>
-            <w:r>
-              <w:t xml:space="preserve">Text field. Populates Contact record. Used for geographic reporting.</w:t>
-            </w:r>
-          </w:p>
-        </w:tc>
-      </w:tr>
-      <w:tr>
-        <w:tc>
-          <w:tcPr>
-            <w:tcW w:type="dxa" w:w="2200"/>
-          </w:tcPr>
-          <w:p>
-            <w:r>
-              <w:rPr>
-                <w:b/>
-              </w:rPr>
-              <w:t>Business Name</w:t>
-            </w:r>
-          </w:p>
-        </w:tc>
-        <w:tc>
-          <w:tcPr>
-            <w:tcW w:type="dxa" w:w="1400"/>
-          </w:tcPr>
-          <w:p>
-            <w:r>
-              <w:t>No</w:t>
-            </w:r>
-          </w:p>
-        </w:tc>
-        <w:tc>
-          <w:tcPr>
-            <w:tcW w:type="dxa" w:w="5760"/>
-          </w:tcPr>
-          <w:p>
-            <w:r>
-              <w:t xml:space="preserve">Text field. Populates Company record. May be left blank for pre-startup applicants who have not yet named their business.</w:t>
-            </w:r>
-          </w:p>
-        </w:tc>
-      </w:tr>
-      <w:tr>
-        <w:tc>
-          <w:tcPr>
-            <w:tcW w:type="dxa" w:w="2200"/>
-            <w:shd w:fill="E8F0F7" w:val="clear"/>
-          </w:tcPr>
-          <w:p>
-            <w:r>
-              <w:rPr>
-                <w:b/>
-              </w:rPr>
-              <w:t>Website</w:t>
-            </w:r>
-          </w:p>
-        </w:tc>
-        <w:tc>
-          <w:tcPr>
-            <w:tcW w:type="dxa" w:w="1400"/>
-            <w:shd w:fill="E8F0F7" w:val="clear"/>
-          </w:tcPr>
-          <w:p>
-            <w:r>
-              <w:t>No</w:t>
-            </w:r>
-          </w:p>
-        </w:tc>
-        <w:tc>
-          <w:tcPr>
-            <w:tcW w:type="dxa" w:w="5760"/>
-            <w:shd w:fill="E8F0F7" w:val="clear"/>
-          </w:tcPr>
-          <w:p>
-            <w:r>
-              <w:t xml:space="preserve">URL field. Populates Company record.</w:t>
-            </w:r>
-          </w:p>
-        </w:tc>
-      </w:tr>
-      <w:tr>
-        <w:tc>
-          <w:tcPr>
-            <w:tcW w:type="dxa" w:w="2200"/>
-          </w:tcPr>
-          <w:p>
-            <w:r>
-              <w:rPr>
-                <w:b/>
-              </w:rPr>
-              <w:t>Address</w:t>
-            </w:r>
-          </w:p>
-        </w:tc>
-        <w:tc>
-          <w:tcPr>
-            <w:tcW w:type="dxa" w:w="1400"/>
-          </w:tcPr>
-          <w:p>
-            <w:r>
-              <w:t>No</w:t>
-            </w:r>
-          </w:p>
-        </w:tc>
-        <w:tc>
-          <w:tcPr>
-            <w:tcW w:type="dxa" w:w="5760"/>
-          </w:tcPr>
-          <w:p>
-            <w:r>
-              <w:t xml:space="preserve">Address field (street, city, state, zip). Populates Company record.</w:t>
-            </w:r>
-          </w:p>
-        </w:tc>
-      </w:tr>
-      <w:tr>
-        <w:tc>
-          <w:tcPr>
-            <w:tcW w:type="dxa" w:w="2200"/>
-            <w:shd w:fill="E8F0F7" w:val="clear"/>
-          </w:tcPr>
-          <w:p>
-            <w:r>
-              <w:rPr>
-                <w:b/>
-              </w:rPr>
-              <w:t>Organization Type</w:t>
-            </w:r>
-          </w:p>
-        </w:tc>
-        <w:tc>
-          <w:tcPr>
-            <w:tcW w:type="dxa" w:w="1400"/>
-            <w:shd w:fill="E8F0F7" w:val="clear"/>
-          </w:tcPr>
-          <w:p>
-            <w:r>
-              <w:t>Yes</w:t>
-            </w:r>
-          </w:p>
-        </w:tc>
-        <w:tc>
-          <w:tcPr>
-            <w:tcW w:type="dxa" w:w="5760"/>
-            <w:shd w:fill="E8F0F7" w:val="clear"/>
-          </w:tcPr>
-          <w:p>
-            <w:r>
-              <w:t xml:space="preserve">Dropdown. Values: For-Profit | Non-Profit. Populates Company record.</w:t>
-            </w:r>
-          </w:p>
-        </w:tc>
-      </w:tr>
-      <w:tr>
-        <w:tc>
-          <w:tcPr>
-            <w:tcW w:type="dxa" w:w="2200"/>
-          </w:tcPr>
-          <w:p>
-            <w:r>
-              <w:rPr>
-                <w:b/>
-              </w:rPr>
-              <w:t>Business Stage</w:t>
-            </w:r>
-          </w:p>
-        </w:tc>
-        <w:tc>
-          <w:tcPr>
-            <w:tcW w:type="dxa" w:w="1400"/>
-          </w:tcPr>
-          <w:p>
-            <w:r>
-              <w:t>Yes</w:t>
-            </w:r>
-          </w:p>
-        </w:tc>
-        <w:tc>
-          <w:tcPr>
-            <w:tcW w:type="dxa" w:w="5760"/>
-          </w:tcPr>
-          <w:p>
-            <w:r>
-              <w:t xml:space="preserve">Dropdown. Values: Pre-Startup | Startup | Early Stage | Growth Stage | Established. Populates Company record.</w:t>
-            </w:r>
-          </w:p>
-        </w:tc>
-      </w:tr>
-      <w:tr>
-        <w:tc>
-          <w:tcPr>
-            <w:tcW w:type="dxa" w:w="2200"/>
-            <w:shd w:fill="E8F0F7" w:val="clear"/>
-          </w:tcPr>
-          <w:p>
-            <w:r>
-              <w:rPr>
-                <w:b/>
-              </w:rPr>
-              <w:t>NAICS Sector</w:t>
-            </w:r>
-          </w:p>
-        </w:tc>
-        <w:tc>
-          <w:tcPr>
-            <w:tcW w:type="dxa" w:w="1400"/>
-            <w:shd w:fill="E8F0F7" w:val="clear"/>
-          </w:tcPr>
-          <w:p>
-            <w:r>
-              <w:t>Yes</w:t>
-            </w:r>
-          </w:p>
-        </w:tc>
-        <w:tc>
-          <w:tcPr>
-            <w:tcW w:type="dxa" w:w="5760"/>
-            <w:shd w:fill="E8F0F7" w:val="clear"/>
-          </w:tcPr>
-          <w:p>
-            <w:r>
-              <w:t xml:space="preserve">Dropdown. Top-level industry classification (20 NAICS sectors). Populates Company record. Drives NAICS Subsector filter.</w:t>
-            </w:r>
-          </w:p>
-        </w:tc>
-      </w:tr>
-      <w:tr>
-        <w:tc>
-          <w:tcPr>
-            <w:tcW w:type="dxa" w:w="2200"/>
-          </w:tcPr>
-          <w:p>
-            <w:r>
-              <w:rPr>
-                <w:b/>
-              </w:rPr>
-              <w:t>NAICS Subsector</w:t>
-            </w:r>
-          </w:p>
-        </w:tc>
-        <w:tc>
-          <w:tcPr>
-            <w:tcW w:type="dxa" w:w="1400"/>
-          </w:tcPr>
-          <w:p>
-            <w:r>
-              <w:t>Yes</w:t>
-            </w:r>
-          </w:p>
-        </w:tc>
-        <w:tc>
-          <w:tcPr>
-            <w:tcW w:type="dxa" w:w="5760"/>
-          </w:tcPr>
-          <w:p>
-            <w:r>
-              <w:t xml:space="preserve">Dropdown. Filtered by selected NAICS Sector (~100 subsectors). Populates Company record.</w:t>
-            </w:r>
-          </w:p>
-        </w:tc>
-      </w:tr>
-      <w:tr>
-        <w:tc>
-          <w:tcPr>
-            <w:tcW w:type="dxa" w:w="2200"/>
-            <w:shd w:fill="E8F0F7" w:val="clear"/>
-          </w:tcPr>
-          <w:p>
-            <w:r>
-              <w:rPr>
-                <w:b/>
-              </w:rPr>
-              <w:t>Mentoring Focus Areas</w:t>
-            </w:r>
-          </w:p>
-        </w:tc>
-        <w:tc>
-          <w:tcPr>
-            <w:tcW w:type="dxa" w:w="1400"/>
-            <w:shd w:fill="E8F0F7" w:val="clear"/>
-          </w:tcPr>
-          <w:p>
-            <w:r>
-              <w:t>Yes</w:t>
-            </w:r>
-          </w:p>
-        </w:tc>
-        <w:tc>
-          <w:tcPr>
-            <w:tcW w:type="dxa" w:w="5760"/>
-            <w:shd w:fill="E8F0F7" w:val="clear"/>
-          </w:tcPr>
-          <w:p>
-            <w:r>
-              <w:t xml:space="preserve">Multi-select dropdown. Values to be defined by CBM leadership. Populates Company record. Used for mentor matching and funder reporting.</w:t>
-            </w:r>
-          </w:p>
-        </w:tc>
-      </w:tr>
-      <w:tr>
-        <w:tc>
-          <w:tcPr>
-            <w:tcW w:type="dxa" w:w="2200"/>
-          </w:tcPr>
-          <w:p>
-            <w:r>
-              <w:rPr>
-                <w:b/>
-              </w:rPr>
-              <w:t>Mentoring Needs Description</w:t>
-            </w:r>
-          </w:p>
-        </w:tc>
-        <w:tc>
-          <w:tcPr>
-            <w:tcW w:type="dxa" w:w="1400"/>
-          </w:tcPr>
-          <w:p>
-            <w:r>
-              <w:t>Yes</w:t>
-            </w:r>
-          </w:p>
-        </w:tc>
-        <w:tc>
-          <w:tcPr>
-            <w:tcW w:type="dxa" w:w="5760"/>
-          </w:tcPr>
-          <w:p>
-            <w:r>
-              <w:t xml:space="preserve">Rich text field. Free-form description of what the client is seeking in a mentoring engagement. Populates Company record.</w:t>
-            </w:r>
-          </w:p>
-        </w:tc>
-      </w:tr>
-    </w:tbl>
-    <w:p>
-      <w:pPr>
-        <w:spacing w:after="120"/>
-      </w:pPr>
-      <w:r>
-        <w:t xml:space="preserve"/>
-      </w:r>
-    </w:p>
-    <w:p>
-      <w:pPr>
-        <w:pStyle w:val="Heading2"/>
-      </w:pPr>
-      <w:r>
-        <w:t xml:space="preserve">4.2 Mentor Application Form</w:t>
-      </w:r>
-    </w:p>
-    <w:p>
-      <w:pPr>
-        <w:spacing w:after="120"/>
-      </w:pPr>
-      <w:r>
-        <w:t xml:space="preserve">The Mentor Application form is the intake channel for prospective mentors. It is a public-facing WordPress form accessible from the Volunteer / Mentor page. On submission, the form posts data to EspoCRM via the REST API and automatically creates a Contact record with Contact Type = Mentor and Mentor Status = Submitted. The new application appears immediately in the admin’s Submitted Mentor Applications list view for review.</w:t>
-      </w:r>
-    </w:p>
-    <w:p>
-      <w:pPr>
-        <w:spacing w:after="80"/>
-      </w:pPr>
-      <w:r>
-        <w:rPr>
-          <w:b/>
-        </w:rPr>
-        <w:t xml:space="preserve">Post-Submission Behavior</w:t>
-      </w:r>
-    </w:p>
-    <w:p>
-      <w:pPr>
-        <w:pStyle w:val="ListParagraph"/>
-        <w:numPr>
-          <w:ilvl w:val="0"/>
-          <w:numId w:val="2"/>
-        </w:numPr>
-        <w:spacing w:after="60"/>
-      </w:pPr>
-      <w:r>
-        <w:t xml:space="preserve">EspoCRM creates a Contact record (Contact Type = Mentor, Mentor Status = Submitted) with all submitted field values populated</w:t>
-      </w:r>
-    </w:p>
-    <w:p>
-      <w:pPr>
-        <w:pStyle w:val="ListParagraph"/>
-        <w:numPr>
-          <w:ilvl w:val="0"/>
-          <w:numId w:val="2"/>
-        </w:numPr>
-        <w:spacing w:after="60"/>
-      </w:pPr>
-      <w:r>
-        <w:t xml:space="preserve">Terms &amp; Conditions Accepted is set to Yes and Terms &amp; Conditions Acceptance Date/Time is set to the submission timestamp</w:t>
-      </w:r>
-    </w:p>
-    <w:p>
-      <w:pPr>
-        <w:pStyle w:val="ListParagraph"/>
-        <w:numPr>
-          <w:ilvl w:val="0"/>
-          <w:numId w:val="2"/>
-        </w:numPr>
-        <w:spacing w:after="60"/>
-      </w:pPr>
-      <w:r>
-        <w:t xml:space="preserve">Applicant receives a confirmation email to their personal email address acknowledging receipt and advising they will be contacted shortly</w:t>
-      </w:r>
-    </w:p>
-    <w:p>
-      <w:pPr>
-        <w:pStyle w:val="ListParagraph"/>
-        <w:numPr>
-          <w:ilvl w:val="0"/>
-          <w:numId w:val="2"/>
-        </w:numPr>
-        <w:spacing w:after="60"/>
-      </w:pPr>
-      <w:r>
-        <w:t xml:space="preserve">Admin receives an automatic system notification of the new application</w:t>
-      </w:r>
-    </w:p>
-    <w:p>
-      <w:pPr>
-        <w:pStyle w:val="ListParagraph"/>
-        <w:numPr>
-          <w:ilvl w:val="0"/>
-          <w:numId w:val="2"/>
-        </w:numPr>
-        <w:spacing w:after="60"/>
-      </w:pPr>
-      <w:r>
-        <w:t xml:space="preserve">If approved after review, admin changes Mentor Status to Provisional and begins the activation workflow</w:t>
-      </w:r>
-    </w:p>
-    <w:p>
-      <w:pPr>
-        <w:pStyle w:val="ListParagraph"/>
-        <w:numPr>
-          <w:ilvl w:val="0"/>
-          <w:numId w:val="2"/>
-        </w:numPr>
-        <w:spacing w:after="60"/>
-      </w:pPr>
-      <w:r>
-        <w:t xml:space="preserve">If declined after review, admin changes Mentor Status to Declined and notifies the applicant manually. No automated notification is sent. The Contact record is retained permanently for historical reference.</w:t>
-      </w:r>
-    </w:p>
-    <w:p>
-      <w:pPr>
-        <w:spacing w:after="80"/>
-      </w:pPr>
-      <w:r>
-        <w:rPr>
-          <w:b/>
-        </w:rPr>
-        <w:t xml:space="preserve">Form Fields</w:t>
-      </w:r>
-    </w:p>
-    <w:p>
-      <w:pPr>
-        <w:spacing w:after="60"/>
-      </w:pPr>
-      <w:r>
-        <w:t xml:space="preserve">The following fields are collected on the form. All fields populate the Contact record. Fields marked Required must be completed before the form can be submitted.</w:t>
-      </w:r>
-    </w:p>
-    <w:tbl>
-      <w:tblPr>
-        <w:tblW w:type="dxa" w:w="9360"/>
-        <w:tblBorders>
-          <w:top w:val="single" w:color="CCCCCC" w:sz="4"/>
-          <w:left w:val="single" w:color="CCCCCC" w:sz="4"/>
-          <w:bottom w:val="single" w:color="CCCCCC" w:sz="4"/>
-          <w:right w:val="single" w:color="CCCCCC" w:sz="4"/>
-          <w:insideH w:val="single" w:color="CCCCCC" w:sz="4"/>
-          <w:insideV w:val="single" w:color="CCCCCC" w:sz="4"/>
-        </w:tblBorders>
-        <w:tblCellMar>
-          <w:top w:type="dxa" w:w="80"/>
-          <w:left w:type="dxa" w:w="120"/>
-          <w:bottom w:type="dxa" w:w="80"/>
-          <w:right w:type="dxa" w:w="120"/>
-        </w:tblCellMar>
-      </w:tblPr>
-      <w:tblGrid>
-        <w:gridCol w:w="2200"/>
-        <w:gridCol w:w="1400"/>
-        <w:gridCol w:w="5760"/>
-      </w:tblGrid>
-      <w:tr>
-        <w:trPr>
-          <w:tblHeader/>
-        </w:trPr>
-        <w:tc>
-          <w:tcPr>
-            <w:tcW w:type="dxa" w:w="2200"/>
-            <w:shd w:fill="2C5F8A" w:val="clear"/>
-          </w:tcPr>
-          <w:p>
-            <w:r>
-              <w:rPr>
-                <w:b/>
-                <w:color w:val="FFFFFF"/>
-              </w:rPr>
-              <w:t>Field</w:t>
-            </w:r>
-          </w:p>
-        </w:tc>
-        <w:tc>
-          <w:tcPr>
-            <w:tcW w:type="dxa" w:w="1400"/>
-            <w:shd w:fill="2C5F8A" w:val="clear"/>
-          </w:tcPr>
-          <w:p>
-            <w:r>
-              <w:rPr>
-                <w:b/>
-                <w:color w:val="FFFFFF"/>
-              </w:rPr>
-              <w:t>Required</w:t>
-            </w:r>
-          </w:p>
-        </w:tc>
-        <w:tc>
-          <w:tcPr>
-            <w:tcW w:type="dxa" w:w="5760"/>
-            <w:shd w:fill="2C5F8A" w:val="clear"/>
-          </w:tcPr>
-          <w:p>
-            <w:r>
-              <w:rPr>
-                <w:b/>
-                <w:color w:val="FFFFFF"/>
-              </w:rPr>
-              <w:t>Description / Notes</w:t>
-            </w:r>
-          </w:p>
-        </w:tc>
-      </w:tr>
-      <w:tr>
-        <w:tc>
-          <w:tcPr>
-            <w:tcW w:type="dxa" w:w="2200"/>
-            <w:shd w:fill="E8F0F7" w:val="clear"/>
-          </w:tcPr>
-          <w:p>
-            <w:r>
-              <w:rPr>
-                <w:b/>
-              </w:rPr>
-              <w:t>First Name</w:t>
-            </w:r>
-          </w:p>
-        </w:tc>
-        <w:tc>
-          <w:tcPr>
-            <w:tcW w:type="dxa" w:w="1400"/>
-            <w:shd w:fill="E8F0F7" w:val="clear"/>
-          </w:tcPr>
-          <w:p>
-            <w:r>
-              <w:t>Yes</w:t>
-            </w:r>
-          </w:p>
-        </w:tc>
-        <w:tc>
-          <w:tcPr>
-            <w:tcW w:type="dxa" w:w="5760"/>
-            <w:shd w:fill="E8F0F7" w:val="clear"/>
-          </w:tcPr>
-          <w:p>
-            <w:r>
-              <w:t>Text field.</w:t>
-            </w:r>
-          </w:p>
-        </w:tc>
-      </w:tr>
-      <w:tr>
-        <w:tc>
-          <w:tcPr>
-            <w:tcW w:type="dxa" w:w="2200"/>
-          </w:tcPr>
-          <w:p>
-            <w:r>
-              <w:rPr>
-                <w:b/>
-              </w:rPr>
-              <w:t>Middle Name</w:t>
-            </w:r>
-          </w:p>
-        </w:tc>
-        <w:tc>
-          <w:tcPr>
-            <w:tcW w:type="dxa" w:w="1400"/>
-          </w:tcPr>
-          <w:p>
-            <w:r>
-              <w:t>No</w:t>
-            </w:r>
-          </w:p>
-        </w:tc>
-        <w:tc>
-          <w:tcPr>
-            <w:tcW w:type="dxa" w:w="5760"/>
-          </w:tcPr>
-          <w:p>
-            <w:r>
-              <w:t>Text field.</w:t>
-            </w:r>
-          </w:p>
-        </w:tc>
-      </w:tr>
-      <w:tr>
-        <w:tc>
-          <w:tcPr>
-            <w:tcW w:type="dxa" w:w="2200"/>
-            <w:shd w:fill="E8F0F7" w:val="clear"/>
-          </w:tcPr>
-          <w:p>
-            <w:r>
-              <w:rPr>
-                <w:b/>
-              </w:rPr>
-              <w:t>Last Name</w:t>
-            </w:r>
-          </w:p>
-        </w:tc>
-        <w:tc>
-          <w:tcPr>
-            <w:tcW w:type="dxa" w:w="1400"/>
-            <w:shd w:fill="E8F0F7" w:val="clear"/>
-          </w:tcPr>
-          <w:p>
-            <w:r>
-              <w:t>Yes</w:t>
-            </w:r>
-          </w:p>
-        </w:tc>
-        <w:tc>
-          <w:tcPr>
-            <w:tcW w:type="dxa" w:w="5760"/>
-            <w:shd w:fill="E8F0F7" w:val="clear"/>
-          </w:tcPr>
-          <w:p>
-            <w:r>
-              <w:t>Text field.</w:t>
-            </w:r>
-          </w:p>
-        </w:tc>
-      </w:tr>
-      <w:tr>
-        <w:tc>
-          <w:tcPr>
-            <w:tcW w:type="dxa" w:w="2200"/>
-          </w:tcPr>
-          <w:p>
-            <w:r>
-              <w:rPr>
-                <w:b/>
-              </w:rPr>
-              <w:t>Preferred Name</w:t>
-            </w:r>
-          </w:p>
-        </w:tc>
-        <w:tc>
-          <w:tcPr>
-            <w:tcW w:type="dxa" w:w="1400"/>
-          </w:tcPr>
-          <w:p>
-            <w:r>
-              <w:t>No</w:t>
-            </w:r>
-          </w:p>
-        </w:tc>
-        <w:tc>
-          <w:tcPr>
-            <w:tcW w:type="dxa" w:w="5760"/>
-          </w:tcPr>
-          <w:p>
-            <w:r>
-              <w:t xml:space="preserve">Text field. The name the mentor prefers to be called. Used in communications and mentor profile.</w:t>
-            </w:r>
-          </w:p>
-        </w:tc>
-      </w:tr>
-      <w:tr>
-        <w:tc>
-          <w:tcPr>
-            <w:tcW w:type="dxa" w:w="2200"/>
-            <w:shd w:fill="E8F0F7" w:val="clear"/>
-          </w:tcPr>
-          <w:p>
-            <w:r>
-              <w:rPr>
-                <w:b/>
-              </w:rPr>
-              <w:t>Personal Email</w:t>
-            </w:r>
-          </w:p>
-        </w:tc>
-        <w:tc>
-          <w:tcPr>
-            <w:tcW w:type="dxa" w:w="1400"/>
-            <w:shd w:fill="E8F0F7" w:val="clear"/>
-          </w:tcPr>
-          <w:p>
-            <w:r>
-              <w:t>Yes</w:t>
-            </w:r>
-          </w:p>
-        </w:tc>
-        <w:tc>
-          <w:tcPr>
-            <w:tcW w:type="dxa" w:w="5760"/>
-            <w:shd w:fill="E8F0F7" w:val="clear"/>
-          </w:tcPr>
-          <w:p>
-            <w:r>
-              <w:t xml:space="preserve">Email field. The applicant’s personal email — not a CBM Gmail address. Used for all onboarding communications prior to CBM Gmail activation.</w:t>
-            </w:r>
-          </w:p>
-        </w:tc>
-      </w:tr>
-      <w:tr>
-        <w:tc>
-          <w:tcPr>
-            <w:tcW w:type="dxa" w:w="2200"/>
-          </w:tcPr>
-          <w:p>
-            <w:r>
-              <w:rPr>
-                <w:b/>
-              </w:rPr>
-              <w:t>Phone</w:t>
-            </w:r>
-          </w:p>
-        </w:tc>
-        <w:tc>
-          <w:tcPr>
-            <w:tcW w:type="dxa" w:w="1400"/>
-          </w:tcPr>
-          <w:p>
-            <w:r>
-              <w:t>No</w:t>
-            </w:r>
-          </w:p>
-        </w:tc>
-        <w:tc>
-          <w:tcPr>
-            <w:tcW w:type="dxa" w:w="5760"/>
-          </w:tcPr>
-          <w:p>
-            <w:r>
-              <w:t>Phone field.</w:t>
-            </w:r>
-          </w:p>
-        </w:tc>
-      </w:tr>
-      <w:tr>
-        <w:tc>
-          <w:tcPr>
-            <w:tcW w:type="dxa" w:w="2200"/>
-            <w:shd w:fill="E8F0F7" w:val="clear"/>
-          </w:tcPr>
-          <w:p>
-            <w:r>
-              <w:rPr>
-                <w:b/>
-              </w:rPr>
-              <w:t>Street Address</w:t>
-            </w:r>
-          </w:p>
-        </w:tc>
-        <w:tc>
-          <w:tcPr>
-            <w:tcW w:type="dxa" w:w="1400"/>
-            <w:shd w:fill="E8F0F7" w:val="clear"/>
-          </w:tcPr>
-          <w:p>
-            <w:r>
-              <w:t>No</w:t>
-            </w:r>
-          </w:p>
-        </w:tc>
-        <w:tc>
-          <w:tcPr>
-            <w:tcW w:type="dxa" w:w="5760"/>
-            <w:shd w:fill="E8F0F7" w:val="clear"/>
-          </w:tcPr>
-          <w:p>
-            <w:r>
-              <w:t xml:space="preserve">Address field (street, city, state, zip).</w:t>
-            </w:r>
-          </w:p>
-        </w:tc>
-      </w:tr>
-      <w:tr>
-        <w:tc>
-          <w:tcPr>
-            <w:tcW w:type="dxa" w:w="2200"/>
-          </w:tcPr>
-          <w:p>
-            <w:r>
-              <w:rPr>
-                <w:b/>
-              </w:rPr>
-              <w:t>LinkedIn Profile URL</w:t>
-            </w:r>
-          </w:p>
-        </w:tc>
-        <w:tc>
-          <w:tcPr>
-            <w:tcW w:type="dxa" w:w="1400"/>
-          </w:tcPr>
-          <w:p>
-            <w:r>
-              <w:t>No</w:t>
-            </w:r>
-          </w:p>
-        </w:tc>
-        <w:tc>
-          <w:tcPr>
-            <w:tcW w:type="dxa" w:w="5760"/>
-          </w:tcPr>
-          <w:p>
-            <w:r>
-              <w:t>URL field.</w:t>
-            </w:r>
-          </w:p>
-        </w:tc>
-      </w:tr>
-      <w:tr>
-        <w:tc>
-          <w:tcPr>
-            <w:tcW w:type="dxa" w:w="2200"/>
-            <w:shd w:fill="E8F0F7" w:val="clear"/>
-          </w:tcPr>
-          <w:p>
-            <w:r>
-              <w:rPr>
-                <w:b/>
-              </w:rPr>
-              <w:t>Currently Employed</w:t>
-            </w:r>
-          </w:p>
-        </w:tc>
-        <w:tc>
-          <w:tcPr>
-            <w:tcW w:type="dxa" w:w="1400"/>
-            <w:shd w:fill="E8F0F7" w:val="clear"/>
-          </w:tcPr>
-          <w:p>
-            <w:r>
-              <w:t>No</w:t>
-            </w:r>
-          </w:p>
-        </w:tc>
-        <w:tc>
-          <w:tcPr>
-            <w:tcW w:type="dxa" w:w="5760"/>
-            <w:shd w:fill="E8F0F7" w:val="clear"/>
-          </w:tcPr>
-          <w:p>
-            <w:r>
-              <w:t xml:space="preserve">Checkbox. Whether the applicant is currently employed at time of application.</w:t>
-            </w:r>
-          </w:p>
-        </w:tc>
-      </w:tr>
-      <w:tr>
-        <w:tc>
-          <w:tcPr>
-            <w:tcW w:type="dxa" w:w="2200"/>
-          </w:tcPr>
-          <w:p>
-            <w:r>
-              <w:rPr>
-                <w:b/>
-              </w:rPr>
-              <w:t>Professional Bio / Work Experience</w:t>
-            </w:r>
-          </w:p>
-        </w:tc>
-        <w:tc>
-          <w:tcPr>
-            <w:tcW w:type="dxa" w:w="1400"/>
-          </w:tcPr>
-          <w:p>
-            <w:r>
-              <w:t>No</w:t>
-            </w:r>
-          </w:p>
-        </w:tc>
-        <w:tc>
-          <w:tcPr>
-            <w:tcW w:type="dxa" w:w="5760"/>
-          </w:tcPr>
-          <w:p>
-            <w:r>
-              <w:t xml:space="preserve">Rich text field. Free-form description of professional background and work experience. Used for mentor profiles and matching.</w:t>
-            </w:r>
-          </w:p>
-        </w:tc>
-      </w:tr>
-      <w:tr>
-        <w:tc>
-          <w:tcPr>
-            <w:tcW w:type="dxa" w:w="2200"/>
-            <w:shd w:fill="E8F0F7" w:val="clear"/>
-          </w:tcPr>
-          <w:p>
-            <w:r>
-              <w:rPr>
-                <w:b/>
-              </w:rPr>
-              <w:t>Industry Experience and Expertise</w:t>
-            </w:r>
-          </w:p>
-        </w:tc>
-        <w:tc>
-          <w:tcPr>
-            <w:tcW w:type="dxa" w:w="1400"/>
-            <w:shd w:fill="E8F0F7" w:val="clear"/>
-          </w:tcPr>
-          <w:p>
-            <w:r>
-              <w:t>No</w:t>
-            </w:r>
-          </w:p>
-        </w:tc>
-        <w:tc>
-          <w:tcPr>
-            <w:tcW w:type="dxa" w:w="5760"/>
-            <w:shd w:fill="E8F0F7" w:val="clear"/>
-          </w:tcPr>
-          <w:p>
-            <w:r>
-              <w:t xml:space="preserve">Multi-select dropdown. Maps to NAICS Sectors and Skills &amp; Expertise Tags on the Contact record. Values TBD.</w:t>
-            </w:r>
-          </w:p>
-        </w:tc>
-      </w:tr>
-      <w:tr>
-        <w:tc>
-          <w:tcPr>
-            <w:tcW w:type="dxa" w:w="2200"/>
-          </w:tcPr>
-          <w:p>
-            <w:r>
-              <w:rPr>
-                <w:b/>
-              </w:rPr>
-              <w:t>Fluent Languages</w:t>
-            </w:r>
-          </w:p>
-        </w:tc>
-        <w:tc>
-          <w:tcPr>
-            <w:tcW w:type="dxa" w:w="1400"/>
-          </w:tcPr>
-          <w:p>
-            <w:r>
-              <w:t>No</w:t>
-            </w:r>
-          </w:p>
-        </w:tc>
-        <w:tc>
-          <w:tcPr>
-            <w:tcW w:type="dxa" w:w="5760"/>
-          </w:tcPr>
-          <w:p>
-            <w:r>
-              <w:t xml:space="preserve">Multi-select dropdown. Languages the applicant is fluent in. Values TBD.</w:t>
-            </w:r>
-          </w:p>
-        </w:tc>
-      </w:tr>
-      <w:tr>
-        <w:tc>
-          <w:tcPr>
-            <w:tcW w:type="dxa" w:w="2200"/>
-            <w:shd w:fill="E8F0F7" w:val="clear"/>
-          </w:tcPr>
-          <w:p>
-            <w:r>
-              <w:rPr>
-                <w:b/>
-              </w:rPr>
-              <w:t>Why Interested in Mentoring</w:t>
-            </w:r>
-          </w:p>
-        </w:tc>
-        <w:tc>
-          <w:tcPr>
-            <w:tcW w:type="dxa" w:w="1400"/>
-            <w:shd w:fill="E8F0F7" w:val="clear"/>
-          </w:tcPr>
-          <w:p>
-            <w:r>
-              <w:t>No</w:t>
-            </w:r>
-          </w:p>
-        </w:tc>
-        <w:tc>
-          <w:tcPr>
-            <w:tcW w:type="dxa" w:w="5760"/>
-            <w:shd w:fill="E8F0F7" w:val="clear"/>
-          </w:tcPr>
-          <w:p>
-            <w:r>
-              <w:t xml:space="preserve">Rich text field. The applicant’s stated motivation for joining CBM as a mentor.</w:t>
-            </w:r>
-          </w:p>
-        </w:tc>
-      </w:tr>
-      <w:tr>
-        <w:tc>
-          <w:tcPr>
-            <w:tcW w:type="dxa" w:w="2200"/>
-          </w:tcPr>
-          <w:p>
-            <w:r>
-              <w:rPr>
-                <w:b/>
-              </w:rPr>
-              <w:t>How Did You Hear About CBM</w:t>
-            </w:r>
-          </w:p>
-        </w:tc>
-        <w:tc>
-          <w:tcPr>
-            <w:tcW w:type="dxa" w:w="1400"/>
-          </w:tcPr>
-          <w:p>
-            <w:r>
-              <w:t>No</w:t>
-            </w:r>
-          </w:p>
-        </w:tc>
-        <w:tc>
-          <w:tcPr>
-            <w:tcW w:type="dxa" w:w="5760"/>
-          </w:tcPr>
-          <w:p>
-            <w:r>
-              <w:t xml:space="preserve">Dropdown. Values TBD. Used for outreach and referral tracking.</w:t>
-            </w:r>
-          </w:p>
-        </w:tc>
-      </w:tr>
-      <w:tr>
-        <w:tc>
-          <w:tcPr>
-            <w:tcW w:type="dxa" w:w="2200"/>
-            <w:shd w:fill="E8F0F7" w:val="clear"/>
-          </w:tcPr>
-          <w:p>
-            <w:r>
-              <w:rPr>
-                <w:b/>
-              </w:rPr>
-              <w:t>Felony Conviction Disclosure</w:t>
-            </w:r>
-          </w:p>
-        </w:tc>
-        <w:tc>
-          <w:tcPr>
-            <w:tcW w:type="dxa" w:w="1400"/>
-            <w:shd w:fill="E8F0F7" w:val="clear"/>
-          </w:tcPr>
-          <w:p>
-            <w:r>
-              <w:t>Yes</w:t>
-            </w:r>
-          </w:p>
-        </w:tc>
-        <w:tc>
-          <w:tcPr>
-            <w:tcW w:type="dxa" w:w="5760"/>
-            <w:shd w:fill="E8F0F7" w:val="clear"/>
-          </w:tcPr>
-          <w:p>
-            <w:r>
-              <w:t xml:space="preserve">Checkbox or Yes/No field. Required disclosure. Reviewed by admin during application screening.</w:t>
-            </w:r>
-          </w:p>
-        </w:tc>
-      </w:tr>
-      <w:tr>
-        <w:tc>
-          <w:tcPr>
-            <w:tcW w:type="dxa" w:w="2200"/>
-          </w:tcPr>
-          <w:p>
-            <w:r>
-              <w:rPr>
-                <w:b/>
-              </w:rPr>
-              <w:t>Terms &amp; Conditions Acceptance</w:t>
-            </w:r>
-          </w:p>
-        </w:tc>
-        <w:tc>
-          <w:tcPr>
-            <w:tcW w:type="dxa" w:w="1400"/>
-          </w:tcPr>
-          <w:p>
-            <w:r>
-              <w:t>Yes</w:t>
-            </w:r>
-          </w:p>
-        </w:tc>
-        <w:tc>
-          <w:tcPr>
-            <w:tcW w:type="dxa" w:w="5760"/>
-          </w:tcPr>
-          <w:p>
-            <w:r>
-              <w:t xml:space="preserve">Checkbox. Must be checked before form can be submitted. Sets Terms &amp; Conditions Accepted = Yes and records the acceptance timestamp on the Contact record.</w:t>
-            </w:r>
-          </w:p>
-        </w:tc>
-      </w:tr>
-    </w:tbl>
-    <w:p>
-      <w:pPr>
-        <w:spacing w:after="120"/>
-      </w:pPr>
       <w:r>
         <w:t xml:space="preserve"/>
       </w:r>

</xml_diff>

<commit_message>
Update website PRD: replace Gravity Forms or WPForms references with Gravity Forms
</commit_message>
<xml_diff>
--- a/PRDs/CBM-PRD-Website.docx
+++ b/PRDs/CBM-PRD-Website.docx
@@ -255,7 +255,7 @@
           <w:b w:val="false"/>
           <w:bCs w:val="false"/>
         </w:rPr>
-        <w:t xml:space="preserve">CRM integration — form plugins (Gravity Forms or WPForms) post data directly to EspoCRM via the REST API</w:t>
+        <w:t xml:space="preserve">CRM integration — Gravity Forms posts data directly to EspoCRM via the REST API</w:t>
       </w:r>
     </w:p>
     <w:p>
@@ -429,7 +429,7 @@
         <w:spacing w:after="120"/>
       </w:pPr>
       <w:r>
-        <w:t xml:space="preserve">WordPress natively supports dynamic form processing through plugins. All intake and registration forms on the CBM website are built using a WordPress form plugin (Gravity Forms or WPForms) and post data directly to EspoCRM via the REST API. The key forms and their integration targets are:</w:t>
+        <w:t xml:space="preserve">WordPress natively supports dynamic form processing through plugins. All intake and registration forms on the CBM website are built using Gravity Forms and post data directly to EspoCRM via the REST API. The key forms and their integration targets are:</w:t>
       </w:r>
     </w:p>
     <w:p>
@@ -510,7 +510,7 @@
           <w:iCs/>
           <w:color w:val="595959"/>
         </w:rPr>
-        <w:t xml:space="preserve">Note: The WordPress form plugin selection (Gravity Forms vs. WPForms) is To Be Determined. Both support REST API webhooks and are compatible with the EspoCRM integration approach. Final selection will be made prior to site build.</w:t>
+        <w:t xml:space="preserve">Note: Gravity Forms has been selected as the WordPress form plugin for all CBM intake forms.</w:t>
       </w:r>
     </w:p>
     <w:p>

</xml_diff>